<commit_message>
JSON Packets.md file updated with Node packets
</commit_message>
<xml_diff>
--- a/Docs/Software Design Document/IR_BLE_Mesh_SW_Document_1.0.0.docx
+++ b/Docs/Software Design Document/IR_BLE_Mesh_SW_Document_1.0.0.docx
@@ -175,7 +175,7 @@
               </mc:Choice>
               <mc:Fallback>
                 <w:pict>
-                  <v:group w14:anchorId="5CCE77E0" id="Group 149" o:spid="_x0000_s1026" style="position:absolute;margin-left:0;margin-top:401.55pt;width:435.4pt;height:11.7pt;z-index:251658243;mso-position-horizontal-relative:page" coordsize="55298,1485" o:gfxdata="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">
+                  <v:group w14:anchorId="551FAD53" id="Group 149" o:spid="_x0000_s1026" style="position:absolute;margin-left:0;margin-top:401.55pt;width:435.4pt;height:11.7pt;z-index:251658243;mso-position-horizontal-relative:page" coordsize="55298,1485" o:gfxdata="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">
                     <v:rect id="Google Shape;11;p2" o:spid="_x0000_s1027" style="position:absolute;left:44509;width:5410;height:1485;visibility:visible;mso-wrap-style:square;v-text-anchor:middle" o:gfxdata="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" fillcolor="#ff9715" stroked="f">
                       <v:textbox inset="1.1607mm,1.1607mm,1.1607mm,1.1607mm"/>
                     </v:rect>
@@ -811,7 +811,7 @@
               </mc:Choice>
               <mc:Fallback>
                 <w:pict>
-                  <v:group w14:anchorId="0E111AE7" id="Group 3" o:spid="_x0000_s1026" style="position:absolute;margin-left:0;margin-top:399.3pt;width:435.4pt;height:11.7pt;z-index:251658240;mso-position-horizontal-relative:page" coordsize="552,14859" o:gfxdata="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">
+                  <v:group w14:anchorId="571BE71F" id="Group 3" o:spid="_x0000_s1026" style="position:absolute;margin-left:0;margin-top:399.3pt;width:435.4pt;height:11.7pt;z-index:251658240;mso-position-horizontal-relative:page" coordsize="552,14859" o:gfxdata="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">
                     <v:rect id="Google Shape;11;p2" o:spid="_x0000_s1027" style="position:absolute;left:445;width:54;height:14;visibility:visible;mso-wrap-style:square;v-text-anchor:middle" o:gfxdata="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" fillcolor="#ff9715" stroked="f">
                       <v:textbox inset="1.1607mm,1.1607mm,1.1607mm,1.1607mm"/>
                     </v:rect>
@@ -1746,21 +1746,7 @@
               <w:rPr>
                 <w:rFonts w:asciiTheme="minorHAnsi" w:hAnsiTheme="minorHAnsi"/>
               </w:rPr>
-              <w:t xml:space="preserve">Changed </w:t>
-            </w:r>
-            <w:proofErr w:type="spellStart"/>
-            <w:r>
-              <w:rPr>
-                <w:rFonts w:asciiTheme="minorHAnsi" w:hAnsiTheme="minorHAnsi"/>
-              </w:rPr>
-              <w:t>ErrorCode</w:t>
-            </w:r>
-            <w:proofErr w:type="spellEnd"/>
-            <w:r>
-              <w:rPr>
-                <w:rFonts w:asciiTheme="minorHAnsi" w:hAnsiTheme="minorHAnsi"/>
-              </w:rPr>
-              <w:t xml:space="preserve"> values</w:t>
+              <w:t>Changed ErrorCode values</w:t>
             </w:r>
           </w:p>
           <w:p>
@@ -1987,21 +1973,7 @@
               <w:rPr>
                 <w:rFonts w:asciiTheme="minorHAnsi" w:hAnsiTheme="minorHAnsi"/>
               </w:rPr>
-              <w:t xml:space="preserve">Added </w:t>
-            </w:r>
-            <w:proofErr w:type="spellStart"/>
-            <w:r>
-              <w:rPr>
-                <w:rFonts w:asciiTheme="minorHAnsi" w:hAnsiTheme="minorHAnsi"/>
-              </w:rPr>
-              <w:t>ResetDevice</w:t>
-            </w:r>
-            <w:proofErr w:type="spellEnd"/>
-            <w:r>
-              <w:rPr>
-                <w:rFonts w:asciiTheme="minorHAnsi" w:hAnsiTheme="minorHAnsi"/>
-              </w:rPr>
-              <w:t xml:space="preserve"> and Logging to the Error code</w:t>
+              <w:t>Added ResetDevice and Logging to the Error code</w:t>
             </w:r>
           </w:p>
           <w:p>
@@ -4890,7 +4862,7 @@
                 <w:rFonts w:asciiTheme="minorHAnsi" w:hAnsiTheme="minorHAnsi"/>
                 <w:lang w:val="en-IN"/>
               </w:rPr>
-              <w:t>Initiate Power Cycle sequence</w:t>
+              <w:t>None</w:t>
             </w:r>
           </w:p>
         </w:tc>
@@ -4912,7 +4884,7 @@
                 <w:rFonts w:asciiTheme="minorHAnsi" w:hAnsiTheme="minorHAnsi"/>
                 <w:lang w:val="en-IN"/>
               </w:rPr>
-              <w:t>Initiate Power Cycle sequence</w:t>
+              <w:t>None</w:t>
             </w:r>
           </w:p>
         </w:tc>
@@ -4958,7 +4930,7 @@
                 <w:rFonts w:asciiTheme="minorHAnsi" w:hAnsiTheme="minorHAnsi"/>
                 <w:lang w:val="en-IN"/>
               </w:rPr>
-              <w:t>None</w:t>
+              <w:t>Initiate Power Cycle sequence</w:t>
             </w:r>
           </w:p>
         </w:tc>
@@ -4980,7 +4952,7 @@
                 <w:rFonts w:asciiTheme="minorHAnsi" w:hAnsiTheme="minorHAnsi"/>
                 <w:lang w:val="en-IN"/>
               </w:rPr>
-              <w:t>None</w:t>
+              <w:t>Initiate Power Cycle sequence</w:t>
             </w:r>
           </w:p>
         </w:tc>
@@ -9400,7 +9372,7 @@
         </mc:Choice>
         <mc:Fallback>
           <w:pict>
-            <v:group w14:anchorId="14D46B47" id="Group 1" o:spid="_x0000_s1026" style="position:absolute;margin-left:0;margin-top:15.25pt;width:594pt;height:12.75pt;z-index:251658241;mso-position-horizontal:left;mso-position-horizontal-relative:page" coordsize="685,14863" o:gfxdata="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">
+            <v:group w14:anchorId="3500A4AC" id="Group 1" o:spid="_x0000_s1026" style="position:absolute;margin-left:0;margin-top:15.25pt;width:594pt;height:12.75pt;z-index:251658241;mso-position-horizontal:left;mso-position-horizontal-relative:page" coordsize="685,14863" o:gfxdata="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">
               <v:rect id="Google Shape;34;p5" o:spid="_x0000_s1027" style="position:absolute;left:551;width:67;height:14;visibility:visible;mso-wrap-style:square;v-text-anchor:middle" o:gfxdata="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" fillcolor="#ff9715" stroked="f">
                 <v:textbox inset="1.1607mm,1.1607mm,1.1607mm,1.1607mm"/>
               </v:rect>
@@ -9822,7 +9794,7 @@
         </mc:Choice>
         <mc:Fallback>
           <w:pict>
-            <v:group w14:anchorId="61DED65A" id="Group 6" o:spid="_x0000_s1026" style="position:absolute;margin-left:0;margin-top:15.25pt;width:594pt;height:12.75pt;z-index:251658243;mso-position-horizontal:left;mso-position-horizontal-relative:page" coordsize="685,14863" o:gfxdata="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">
+            <v:group w14:anchorId="75C66F78" id="Group 6" o:spid="_x0000_s1026" style="position:absolute;margin-left:0;margin-top:15.25pt;width:594pt;height:12.75pt;z-index:251658243;mso-position-horizontal:left;mso-position-horizontal-relative:page" coordsize="685,14863" o:gfxdata="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">
               <v:rect id="Google Shape;34;p5" o:spid="_x0000_s1027" style="position:absolute;left:551;width:67;height:14;visibility:visible;mso-wrap-style:square;v-text-anchor:middle" o:gfxdata="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" fillcolor="#ff9715" stroked="f">
                 <v:textbox inset="1.1607mm,1.1607mm,1.1607mm,1.1607mm"/>
               </v:rect>
@@ -21257,7 +21229,6 @@
   <w:rsids>
     <w:rsidRoot w:val="00655064"/>
     <w:rsid w:val="000555FD"/>
-    <w:rsid w:val="00075F2F"/>
     <w:rsid w:val="0012564D"/>
     <w:rsid w:val="00127AC0"/>
     <w:rsid w:val="00130AF1"/>
@@ -21290,6 +21261,7 @@
     <w:rsid w:val="00997DDA"/>
     <w:rsid w:val="00A42C78"/>
     <w:rsid w:val="00A71DBA"/>
+    <w:rsid w:val="00A76BCC"/>
     <w:rsid w:val="00BF70A0"/>
     <w:rsid w:val="00C3009C"/>
     <w:rsid w:val="00D130C0"/>

</xml_diff>

<commit_message>
IR Reception has some issues
</commit_message>
<xml_diff>
--- a/Docs/Software Design Document/IR_BLE_Mesh_SW_Document_1.0.0.docx
+++ b/Docs/Software Design Document/IR_BLE_Mesh_SW_Document_1.0.0.docx
@@ -1,6 +1,6 @@
 
 <file path=word/document.xml><?xml version="1.0" encoding="utf-8"?>
-<w:document xmlns:wpc="http://schemas.microsoft.com/office/word/2010/wordprocessingCanvas" xmlns:cx="http://schemas.microsoft.com/office/drawing/2014/chartex" xmlns:cx1="http://schemas.microsoft.com/office/drawing/2015/9/8/chartex" xmlns:cx2="http://schemas.microsoft.com/office/drawing/2015/10/21/chartex" xmlns:cx3="http://schemas.microsoft.com/office/drawing/2016/5/9/chartex" xmlns:cx4="http://schemas.microsoft.com/office/drawing/2016/5/10/chartex" xmlns:cx5="http://schemas.microsoft.com/office/drawing/2016/5/11/chartex" xmlns:cx6="http://schemas.microsoft.com/office/drawing/2016/5/12/chartex" xmlns:cx7="http://schemas.microsoft.com/office/drawing/2016/5/13/chartex" xmlns:cx8="http://schemas.microsoft.com/office/drawing/2016/5/14/chartex" xmlns:mc="http://schemas.openxmlformats.org/markup-compatibility/2006" xmlns:aink="http://schemas.microsoft.com/office/drawing/2016/ink" xmlns:am3d="http://schemas.microsoft.com/office/drawing/2017/model3d" xmlns:o="urn:schemas-microsoft-com:office:office" xmlns:oel="http://schemas.microsoft.com/office/2019/extlst" xmlns:r="http://schemas.openxmlformats.org/officeDocument/2006/relationships" xmlns:m="http://schemas.openxmlformats.org/officeDocument/2006/math" xmlns:v="urn:schemas-microsoft-com:vml" xmlns:wp14="http://schemas.microsoft.com/office/word/2010/wordprocessingDrawing" xmlns:wp="http://schemas.openxmlformats.org/drawingml/2006/wordprocessingDrawing" xmlns:w10="urn:schemas-microsoft-com:office:word" xmlns:w="http://schemas.openxmlformats.org/wordprocessingml/2006/main" xmlns:w14="http://schemas.microsoft.com/office/word/2010/wordml" xmlns:w15="http://schemas.microsoft.com/office/word/2012/wordml" xmlns:w16cex="http://schemas.microsoft.com/office/word/2018/wordml/cex" xmlns:w16cid="http://schemas.microsoft.com/office/word/2016/wordml/cid" xmlns:w16="http://schemas.microsoft.com/office/word/2018/wordml" xmlns:w16du="http://schemas.microsoft.com/office/word/2023/wordml/word16du" xmlns:w16sdtdh="http://schemas.microsoft.com/office/word/2020/wordml/sdtdatahash" xmlns:w16se="http://schemas.microsoft.com/office/word/2015/wordml/symex" xmlns:wpg="http://schemas.microsoft.com/office/word/2010/wordprocessingGroup" xmlns:wpi="http://schemas.microsoft.com/office/word/2010/wordprocessingInk" xmlns:wne="http://schemas.microsoft.com/office/word/2006/wordml" xmlns:wps="http://schemas.microsoft.com/office/word/2010/wordprocessingShape" mc:Ignorable="w14 w15 w16se w16cid w16 w16cex w16sdtdh w16du wp14">
+<w:document xmlns:wpc="http://schemas.microsoft.com/office/word/2010/wordprocessingCanvas" xmlns:cx="http://schemas.microsoft.com/office/drawing/2014/chartex" xmlns:cx1="http://schemas.microsoft.com/office/drawing/2015/9/8/chartex" xmlns:cx2="http://schemas.microsoft.com/office/drawing/2015/10/21/chartex" xmlns:cx3="http://schemas.microsoft.com/office/drawing/2016/5/9/chartex" xmlns:cx4="http://schemas.microsoft.com/office/drawing/2016/5/10/chartex" xmlns:cx5="http://schemas.microsoft.com/office/drawing/2016/5/11/chartex" xmlns:cx6="http://schemas.microsoft.com/office/drawing/2016/5/12/chartex" xmlns:cx7="http://schemas.microsoft.com/office/drawing/2016/5/13/chartex" xmlns:cx8="http://schemas.microsoft.com/office/drawing/2016/5/14/chartex" xmlns:mc="http://schemas.openxmlformats.org/markup-compatibility/2006" xmlns:aink="http://schemas.microsoft.com/office/drawing/2016/ink" xmlns:am3d="http://schemas.microsoft.com/office/drawing/2017/model3d" xmlns:o="urn:schemas-microsoft-com:office:office" xmlns:oel="http://schemas.microsoft.com/office/2019/extlst" xmlns:r="http://schemas.openxmlformats.org/officeDocument/2006/relationships" xmlns:m="http://schemas.openxmlformats.org/officeDocument/2006/math" xmlns:v="urn:schemas-microsoft-com:vml" xmlns:wp14="http://schemas.microsoft.com/office/word/2010/wordprocessingDrawing" xmlns:wp="http://schemas.openxmlformats.org/drawingml/2006/wordprocessingDrawing" xmlns:w10="urn:schemas-microsoft-com:office:word" xmlns:w="http://schemas.openxmlformats.org/wordprocessingml/2006/main" xmlns:w14="http://schemas.microsoft.com/office/word/2010/wordml" xmlns:w15="http://schemas.microsoft.com/office/word/2012/wordml" xmlns:w16cex="http://schemas.microsoft.com/office/word/2018/wordml/cex" xmlns:w16cid="http://schemas.microsoft.com/office/word/2016/wordml/cid" xmlns:w16="http://schemas.microsoft.com/office/word/2018/wordml" xmlns:w16du="http://schemas.microsoft.com/office/word/2023/wordml/word16du" xmlns:w16sdtdh="http://schemas.microsoft.com/office/word/2020/wordml/sdtdatahash" xmlns:w16sdtfl="http://schemas.microsoft.com/office/word/2024/wordml/sdtformatlock" xmlns:w16se="http://schemas.microsoft.com/office/word/2015/wordml/symex" xmlns:wpg="http://schemas.microsoft.com/office/word/2010/wordprocessingGroup" xmlns:wpi="http://schemas.microsoft.com/office/word/2010/wordprocessingInk" xmlns:wne="http://schemas.microsoft.com/office/word/2006/wordml" xmlns:wps="http://schemas.microsoft.com/office/word/2010/wordprocessingShape" mc:Ignorable="w14 w15 w16se w16cid w16 w16cex w16sdtdh w16sdtfl w16du wp14">
   <w:body>
     <w:p>
       <w:pPr>
@@ -271,7 +271,7 @@
                                     <w:szCs w:val="32"/>
                                     <w:lang w:val="en-IN"/>
                                   </w:rPr>
-                                  <w:t>Dec</w:t>
+                                  <w:t>Jan</w:t>
                                 </w:r>
                                 <w:r>
                                   <w:rPr>
@@ -291,7 +291,7 @@
                                     <w:szCs w:val="32"/>
                                     <w:lang w:val="en-IN"/>
                                   </w:rPr>
-                                  <w:t>03</w:t>
+                                  <w:t>23</w:t>
                                 </w:r>
                                 <w:r>
                                   <w:rPr>
@@ -311,7 +311,7 @@
                                     <w:szCs w:val="32"/>
                                     <w:lang w:val="en-IN"/>
                                   </w:rPr>
-                                  <w:t>4</w:t>
+                                  <w:t>5</w:t>
                                 </w:r>
                                 <w:r>
                                   <w:rPr>
@@ -367,7 +367,7 @@
                               <w:szCs w:val="32"/>
                               <w:lang w:val="en-IN"/>
                             </w:rPr>
-                            <w:t>Dec</w:t>
+                            <w:t>Jan</w:t>
                           </w:r>
                           <w:r>
                             <w:rPr>
@@ -387,7 +387,7 @@
                               <w:szCs w:val="32"/>
                               <w:lang w:val="en-IN"/>
                             </w:rPr>
-                            <w:t>03</w:t>
+                            <w:t>23</w:t>
                           </w:r>
                           <w:r>
                             <w:rPr>
@@ -407,7 +407,7 @@
                               <w:szCs w:val="32"/>
                               <w:lang w:val="en-IN"/>
                             </w:rPr>
-                            <w:t>4</w:t>
+                            <w:t>5</w:t>
                           </w:r>
                           <w:r>
                             <w:rPr>
@@ -2294,7 +2294,7 @@
               <w:rPr>
                 <w:rFonts w:ascii="Calibri Light" w:hAnsi="Calibri Light"/>
               </w:rPr>
-              <w:t>1.0.0</w:t>
+              <w:t>0.8</w:t>
             </w:r>
           </w:p>
         </w:tc>
@@ -2322,25 +2322,7 @@
               <w:rPr>
                 <w:rFonts w:ascii="Calibri Light" w:hAnsi="Calibri Light"/>
               </w:rPr>
-              <w:t>03</w:t>
-            </w:r>
-            <w:r>
-              <w:rPr>
-                <w:rFonts w:ascii="Calibri Light" w:hAnsi="Calibri Light"/>
-              </w:rPr>
-              <w:t>.1</w:t>
-            </w:r>
-            <w:r>
-              <w:rPr>
-                <w:rFonts w:ascii="Calibri Light" w:hAnsi="Calibri Light"/>
-              </w:rPr>
-              <w:t>2</w:t>
-            </w:r>
-            <w:r>
-              <w:rPr>
-                <w:rFonts w:ascii="Calibri Light" w:hAnsi="Calibri Light"/>
-              </w:rPr>
-              <w:t>.2024</w:t>
+              <w:t>-</w:t>
             </w:r>
           </w:p>
         </w:tc>
@@ -2368,7 +2350,7 @@
               <w:rPr>
                 <w:rFonts w:ascii="Calibri Light" w:hAnsi="Calibri Light"/>
               </w:rPr>
-              <w:t>Kulasekaran</w:t>
+              <w:t>-</w:t>
             </w:r>
           </w:p>
         </w:tc>
@@ -2404,9 +2386,124 @@
               <w:rPr>
                 <w:rFonts w:ascii="Calibri Light" w:hAnsi="Calibri Light"/>
               </w:rPr>
-              <w:t>Node provisioning flow modified</w:t>
-            </w:r>
-          </w:p>
+              <w:t>-</w:t>
+            </w:r>
+          </w:p>
+        </w:tc>
+      </w:tr>
+      <w:tr>
+        <w:tc>
+          <w:tcPr>
+            <w:tcW w:w="993" w:type="dxa"/>
+            <w:tcBorders>
+              <w:top w:val="single" w:sz="4" w:space="0" w:color="auto"/>
+              <w:left w:val="single" w:sz="4" w:space="0" w:color="auto"/>
+              <w:bottom w:val="single" w:sz="4" w:space="0" w:color="auto"/>
+              <w:right w:val="single" w:sz="4" w:space="0" w:color="auto"/>
+            </w:tcBorders>
+          </w:tcPr>
+          <w:p>
+            <w:pPr>
+              <w:pStyle w:val="TableContents"/>
+              <w:snapToGrid w:val="0"/>
+              <w:spacing w:line="240" w:lineRule="auto"/>
+              <w:jc w:val="center"/>
+              <w:rPr>
+                <w:rFonts w:ascii="Calibri Light" w:hAnsi="Calibri Light"/>
+              </w:rPr>
+            </w:pPr>
+            <w:r>
+              <w:rPr>
+                <w:rFonts w:ascii="Calibri Light" w:hAnsi="Calibri Light"/>
+              </w:rPr>
+              <w:t>0.9</w:t>
+            </w:r>
+          </w:p>
+        </w:tc>
+        <w:tc>
+          <w:tcPr>
+            <w:tcW w:w="1417" w:type="dxa"/>
+            <w:tcBorders>
+              <w:top w:val="single" w:sz="4" w:space="0" w:color="auto"/>
+              <w:left w:val="single" w:sz="4" w:space="0" w:color="auto"/>
+              <w:bottom w:val="single" w:sz="4" w:space="0" w:color="auto"/>
+              <w:right w:val="single" w:sz="4" w:space="0" w:color="auto"/>
+            </w:tcBorders>
+          </w:tcPr>
+          <w:p>
+            <w:pPr>
+              <w:pStyle w:val="TableContents"/>
+              <w:snapToGrid w:val="0"/>
+              <w:spacing w:line="240" w:lineRule="auto"/>
+              <w:jc w:val="center"/>
+              <w:rPr>
+                <w:rFonts w:ascii="Calibri Light" w:hAnsi="Calibri Light"/>
+              </w:rPr>
+            </w:pPr>
+            <w:r>
+              <w:rPr>
+                <w:rFonts w:ascii="Calibri Light" w:hAnsi="Calibri Light"/>
+              </w:rPr>
+              <w:t>03</w:t>
+            </w:r>
+            <w:r>
+              <w:rPr>
+                <w:rFonts w:ascii="Calibri Light" w:hAnsi="Calibri Light"/>
+              </w:rPr>
+              <w:t>.1</w:t>
+            </w:r>
+            <w:r>
+              <w:rPr>
+                <w:rFonts w:ascii="Calibri Light" w:hAnsi="Calibri Light"/>
+              </w:rPr>
+              <w:t>2</w:t>
+            </w:r>
+            <w:r>
+              <w:rPr>
+                <w:rFonts w:ascii="Calibri Light" w:hAnsi="Calibri Light"/>
+              </w:rPr>
+              <w:t>.2024</w:t>
+            </w:r>
+          </w:p>
+        </w:tc>
+        <w:tc>
+          <w:tcPr>
+            <w:tcW w:w="1559" w:type="dxa"/>
+            <w:tcBorders>
+              <w:top w:val="single" w:sz="4" w:space="0" w:color="auto"/>
+              <w:left w:val="single" w:sz="4" w:space="0" w:color="auto"/>
+              <w:bottom w:val="single" w:sz="4" w:space="0" w:color="auto"/>
+              <w:right w:val="single" w:sz="4" w:space="0" w:color="auto"/>
+            </w:tcBorders>
+          </w:tcPr>
+          <w:p>
+            <w:pPr>
+              <w:pStyle w:val="TableContents"/>
+              <w:snapToGrid w:val="0"/>
+              <w:spacing w:line="240" w:lineRule="auto"/>
+              <w:jc w:val="center"/>
+              <w:rPr>
+                <w:rFonts w:ascii="Calibri Light" w:hAnsi="Calibri Light"/>
+              </w:rPr>
+            </w:pPr>
+            <w:r>
+              <w:rPr>
+                <w:rFonts w:ascii="Calibri Light" w:hAnsi="Calibri Light"/>
+              </w:rPr>
+              <w:t>Kulasekaran</w:t>
+            </w:r>
+          </w:p>
+        </w:tc>
+        <w:tc>
+          <w:tcPr>
+            <w:tcW w:w="5954" w:type="dxa"/>
+            <w:tcBorders>
+              <w:top w:val="single" w:sz="4" w:space="0" w:color="auto"/>
+              <w:left w:val="single" w:sz="4" w:space="0" w:color="auto"/>
+              <w:bottom w:val="single" w:sz="4" w:space="0" w:color="auto"/>
+              <w:right w:val="single" w:sz="4" w:space="0" w:color="auto"/>
+            </w:tcBorders>
+          </w:tcPr>
           <w:p>
             <w:pPr>
               <w:pStyle w:val="TableContents"/>
@@ -2429,7 +2526,7 @@
               <w:rPr>
                 <w:rFonts w:ascii="Calibri Light" w:hAnsi="Calibri Light"/>
               </w:rPr>
-              <w:t>Button press functionalities modified</w:t>
+              <w:t>Node provisioning flow modified</w:t>
             </w:r>
           </w:p>
           <w:p>
@@ -2454,7 +2551,8 @@
               <w:rPr>
                 <w:rFonts w:ascii="Calibri Light" w:hAnsi="Calibri Light"/>
               </w:rPr>
-              <w:t>Error codes modified</w:t>
+              <w:lastRenderedPageBreak/>
+              <w:t>Button press functionalities modified</w:t>
             </w:r>
           </w:p>
           <w:p>
@@ -2479,8 +2577,7 @@
               <w:rPr>
                 <w:rFonts w:ascii="Calibri Light" w:hAnsi="Calibri Light"/>
               </w:rPr>
-              <w:lastRenderedPageBreak/>
-              <w:t>JSON Packet modified</w:t>
+              <w:t>Error codes modified</w:t>
             </w:r>
           </w:p>
           <w:p>
@@ -2505,7 +2602,7 @@
               <w:rPr>
                 <w:rFonts w:ascii="Calibri Light" w:hAnsi="Calibri Light"/>
               </w:rPr>
-              <w:t>Teaching mode modified</w:t>
+              <w:t>JSON Packet modified</w:t>
             </w:r>
           </w:p>
           <w:p>
@@ -2530,7 +2627,173 @@
               <w:rPr>
                 <w:rFonts w:ascii="Calibri Light" w:hAnsi="Calibri Light"/>
               </w:rPr>
+              <w:t>Teaching mode modified</w:t>
+            </w:r>
+          </w:p>
+          <w:p>
+            <w:pPr>
+              <w:pStyle w:val="TableContents"/>
+              <w:numPr>
+                <w:ilvl w:val="0"/>
+                <w:numId w:val="25"/>
+              </w:numPr>
+              <w:tabs>
+                <w:tab w:val="left" w:pos="85"/>
+              </w:tabs>
+              <w:snapToGrid w:val="0"/>
+              <w:spacing w:after="0" w:line="240" w:lineRule="auto"/>
+              <w:ind w:left="714" w:hanging="357"/>
+              <w:jc w:val="both"/>
+              <w:rPr>
+                <w:rFonts w:ascii="Calibri Light" w:hAnsi="Calibri Light"/>
+              </w:rPr>
+            </w:pPr>
+            <w:r>
+              <w:rPr>
+                <w:rFonts w:ascii="Calibri Light" w:hAnsi="Calibri Light"/>
+              </w:rPr>
               <w:t>LED indications modified</w:t>
+            </w:r>
+          </w:p>
+        </w:tc>
+      </w:tr>
+      <w:tr>
+        <w:tc>
+          <w:tcPr>
+            <w:tcW w:w="993" w:type="dxa"/>
+            <w:tcBorders>
+              <w:top w:val="single" w:sz="4" w:space="0" w:color="auto"/>
+              <w:left w:val="single" w:sz="4" w:space="0" w:color="auto"/>
+              <w:bottom w:val="single" w:sz="4" w:space="0" w:color="auto"/>
+              <w:right w:val="single" w:sz="4" w:space="0" w:color="auto"/>
+            </w:tcBorders>
+          </w:tcPr>
+          <w:p>
+            <w:pPr>
+              <w:pStyle w:val="TableContents"/>
+              <w:snapToGrid w:val="0"/>
+              <w:spacing w:line="240" w:lineRule="auto"/>
+              <w:jc w:val="center"/>
+              <w:rPr>
+                <w:rFonts w:ascii="Calibri Light" w:hAnsi="Calibri Light"/>
+              </w:rPr>
+            </w:pPr>
+            <w:r>
+              <w:rPr>
+                <w:rFonts w:ascii="Calibri Light" w:hAnsi="Calibri Light"/>
+              </w:rPr>
+              <w:lastRenderedPageBreak/>
+              <w:t>1.0</w:t>
+            </w:r>
+          </w:p>
+        </w:tc>
+        <w:tc>
+          <w:tcPr>
+            <w:tcW w:w="1417" w:type="dxa"/>
+            <w:tcBorders>
+              <w:top w:val="single" w:sz="4" w:space="0" w:color="auto"/>
+              <w:left w:val="single" w:sz="4" w:space="0" w:color="auto"/>
+              <w:bottom w:val="single" w:sz="4" w:space="0" w:color="auto"/>
+              <w:right w:val="single" w:sz="4" w:space="0" w:color="auto"/>
+            </w:tcBorders>
+          </w:tcPr>
+          <w:p>
+            <w:pPr>
+              <w:pStyle w:val="TableContents"/>
+              <w:snapToGrid w:val="0"/>
+              <w:spacing w:line="240" w:lineRule="auto"/>
+              <w:jc w:val="center"/>
+              <w:rPr>
+                <w:rFonts w:ascii="Calibri Light" w:hAnsi="Calibri Light"/>
+              </w:rPr>
+            </w:pPr>
+            <w:r>
+              <w:rPr>
+                <w:rFonts w:ascii="Calibri Light" w:hAnsi="Calibri Light"/>
+              </w:rPr>
+              <w:t>23.01.2025</w:t>
+            </w:r>
+          </w:p>
+        </w:tc>
+        <w:tc>
+          <w:tcPr>
+            <w:tcW w:w="1559" w:type="dxa"/>
+            <w:tcBorders>
+              <w:top w:val="single" w:sz="4" w:space="0" w:color="auto"/>
+              <w:left w:val="single" w:sz="4" w:space="0" w:color="auto"/>
+              <w:bottom w:val="single" w:sz="4" w:space="0" w:color="auto"/>
+              <w:right w:val="single" w:sz="4" w:space="0" w:color="auto"/>
+            </w:tcBorders>
+          </w:tcPr>
+          <w:p>
+            <w:pPr>
+              <w:pStyle w:val="TableContents"/>
+              <w:snapToGrid w:val="0"/>
+              <w:spacing w:line="240" w:lineRule="auto"/>
+              <w:jc w:val="center"/>
+              <w:rPr>
+                <w:rFonts w:ascii="Calibri Light" w:hAnsi="Calibri Light"/>
+              </w:rPr>
+            </w:pPr>
+            <w:r>
+              <w:rPr>
+                <w:rFonts w:ascii="Calibri Light" w:hAnsi="Calibri Light"/>
+              </w:rPr>
+              <w:t>Kulasekaran</w:t>
+            </w:r>
+          </w:p>
+        </w:tc>
+        <w:tc>
+          <w:tcPr>
+            <w:tcW w:w="5954" w:type="dxa"/>
+            <w:tcBorders>
+              <w:top w:val="single" w:sz="4" w:space="0" w:color="auto"/>
+              <w:left w:val="single" w:sz="4" w:space="0" w:color="auto"/>
+              <w:bottom w:val="single" w:sz="4" w:space="0" w:color="auto"/>
+              <w:right w:val="single" w:sz="4" w:space="0" w:color="auto"/>
+            </w:tcBorders>
+          </w:tcPr>
+          <w:p>
+            <w:pPr>
+              <w:pStyle w:val="TableContents"/>
+              <w:numPr>
+                <w:ilvl w:val="0"/>
+                <w:numId w:val="25"/>
+              </w:numPr>
+              <w:tabs>
+                <w:tab w:val="left" w:pos="85"/>
+              </w:tabs>
+              <w:snapToGrid w:val="0"/>
+              <w:spacing w:after="0" w:line="240" w:lineRule="auto"/>
+              <w:ind w:left="714" w:hanging="357"/>
+              <w:jc w:val="both"/>
+              <w:rPr>
+                <w:rFonts w:ascii="Calibri Light" w:hAnsi="Calibri Light"/>
+              </w:rPr>
+            </w:pPr>
+            <w:r>
+              <w:rPr>
+                <w:rFonts w:ascii="Calibri Light" w:hAnsi="Calibri Light"/>
+              </w:rPr>
+              <w:t>Added Invalid format error</w:t>
+            </w:r>
+            <w:r>
+              <w:rPr>
+                <w:rFonts w:ascii="Calibri Light" w:hAnsi="Calibri Light"/>
+              </w:rPr>
+              <w:t xml:space="preserve"> </w:t>
+            </w:r>
+            <w:r>
+              <w:rPr>
+                <w:rFonts w:ascii="Calibri Light" w:hAnsi="Calibri Light"/>
+              </w:rPr>
+              <w:t>code</w:t>
+            </w:r>
+            <w:r>
+              <w:rPr>
+                <w:rFonts w:ascii="Calibri Light" w:hAnsi="Calibri Light"/>
+              </w:rPr>
+              <w:t>s</w:t>
             </w:r>
           </w:p>
         </w:tc>
@@ -4366,13 +4629,7 @@
         <w:rPr>
           <w:lang w:val="en-IN"/>
         </w:rPr>
-        <w:t xml:space="preserve">: </w:t>
-      </w:r>
-      <w:r>
-        <w:rPr>
-          <w:lang w:val="en-IN"/>
-        </w:rPr>
-        <w:t>Provides the ability to store contents in flash memory to preserve them across power cycles</w:t>
+        <w:t>: Provides the ability to store contents in flash memory to preserve them across power cycles</w:t>
       </w:r>
     </w:p>
     <w:p>
@@ -4731,13 +4988,7 @@
         <w:rPr>
           <w:lang w:val="en-IN"/>
         </w:rPr>
-        <w:t>:</w:t>
-      </w:r>
-      <w:r>
-        <w:rPr>
-          <w:lang w:val="en-IN"/>
-        </w:rPr>
-        <w:t xml:space="preserve"> Since Teaching Mode works by capturing and storing the IR signal RAW values and replaying them back to control an AC, only a maximum of 16 commands can be stored currently. (Power off command, Temperature 18 to Temperature 32 </w:t>
+        <w:t xml:space="preserve">: Since Teaching Mode works by capturing and storing the IR signal RAW values and replaying them back to control an AC, only a maximum of 16 commands can be stored currently. (Power off command, Temperature 18 to Temperature 32 </w:t>
       </w:r>
       <w:r>
         <w:rPr>
@@ -16427,6 +16678,9 @@
           <w:p>
             <w:pPr>
               <w:jc w:val="center"/>
+              <w:rPr>
+                <w:rFonts w:ascii="Calibri Light" w:hAnsi="Calibri Light"/>
+              </w:rPr>
             </w:pPr>
             <w:r>
               <w:rPr>
@@ -16444,11 +16698,13 @@
             <w:pPr>
               <w:cnfStyle w:val="000000000000" w:firstRow="0" w:lastRow="0" w:firstColumn="0" w:lastColumn="0" w:oddVBand="0" w:evenVBand="0" w:oddHBand="0" w:evenHBand="0" w:firstRowFirstColumn="0" w:firstRowLastColumn="0" w:lastRowFirstColumn="0" w:lastRowLastColumn="0"/>
               <w:rPr>
-                <w:lang w:val="en-IN"/>
-              </w:rPr>
-            </w:pPr>
-            <w:r>
-              <w:rPr>
+                <w:rFonts w:ascii="Calibri Light" w:hAnsi="Calibri Light"/>
+                <w:lang w:val="en-IN"/>
+              </w:rPr>
+            </w:pPr>
+            <w:r>
+              <w:rPr>
+                <w:rFonts w:ascii="Calibri Light" w:hAnsi="Calibri Light"/>
                 <w:lang w:val="en-IN"/>
               </w:rPr>
               <w:t>IR_PROTOCOL_FULLY_UNSUPPORTED</w:t>
@@ -16465,6 +16721,9 @@
           <w:p>
             <w:pPr>
               <w:jc w:val="center"/>
+              <w:rPr>
+                <w:rFonts w:ascii="Calibri Light" w:hAnsi="Calibri Light"/>
+              </w:rPr>
             </w:pPr>
             <w:r>
               <w:rPr>
@@ -16482,11 +16741,13 @@
             <w:pPr>
               <w:cnfStyle w:val="000000000000" w:firstRow="0" w:lastRow="0" w:firstColumn="0" w:lastColumn="0" w:oddVBand="0" w:evenVBand="0" w:oddHBand="0" w:evenHBand="0" w:firstRowFirstColumn="0" w:firstRowLastColumn="0" w:lastRowFirstColumn="0" w:lastRowLastColumn="0"/>
               <w:rPr>
-                <w:lang w:val="en-IN"/>
-              </w:rPr>
-            </w:pPr>
-            <w:r>
-              <w:rPr>
+                <w:rFonts w:ascii="Calibri Light" w:hAnsi="Calibri Light"/>
+                <w:lang w:val="en-IN"/>
+              </w:rPr>
+            </w:pPr>
+            <w:r>
+              <w:rPr>
+                <w:rFonts w:ascii="Calibri Light" w:hAnsi="Calibri Light"/>
                 <w:lang w:val="en-IN"/>
               </w:rPr>
               <w:t>MISSING_ERROR_CHECK</w:t>
@@ -16503,6 +16764,9 @@
           <w:p>
             <w:pPr>
               <w:jc w:val="center"/>
+              <w:rPr>
+                <w:rFonts w:ascii="Calibri Light" w:hAnsi="Calibri Light"/>
+              </w:rPr>
             </w:pPr>
             <w:r>
               <w:rPr>
@@ -16520,11 +16784,13 @@
             <w:pPr>
               <w:cnfStyle w:val="000000000000" w:firstRow="0" w:lastRow="0" w:firstColumn="0" w:lastColumn="0" w:oddVBand="0" w:evenVBand="0" w:oddHBand="0" w:evenHBand="0" w:firstRowFirstColumn="0" w:firstRowLastColumn="0" w:lastRowFirstColumn="0" w:lastRowLastColumn="0"/>
               <w:rPr>
-                <w:lang w:val="en-IN"/>
-              </w:rPr>
-            </w:pPr>
-            <w:r>
-              <w:rPr>
+                <w:rFonts w:ascii="Calibri Light" w:hAnsi="Calibri Light"/>
+                <w:lang w:val="en-IN"/>
+              </w:rPr>
+            </w:pPr>
+            <w:r>
+              <w:rPr>
+                <w:rFonts w:ascii="Calibri Light" w:hAnsi="Calibri Light"/>
                 <w:lang w:val="en-IN"/>
               </w:rPr>
               <w:t>ERROR_CHECK_EXCEEDING_RANGE</w:t>
@@ -17387,13 +17653,7 @@
               <w:rPr>
                 <w:rFonts w:ascii="Calibri Light" w:hAnsi="Calibri Light"/>
               </w:rPr>
-              <w:t>6</w:t>
-            </w:r>
-            <w:r>
-              <w:rPr>
-                <w:rFonts w:ascii="Calibri Light" w:hAnsi="Calibri Light"/>
-              </w:rPr>
-              <w:t>9</w:t>
+              <w:t>69</w:t>
             </w:r>
           </w:p>
         </w:tc>
@@ -17501,6 +17761,987 @@
                 <w:rFonts w:ascii="Calibri Light" w:hAnsi="Calibri Light"/>
               </w:rPr>
               <w:t>IR_PARTITION_INIT_FAILED (QMAX ‘s Internal Use only)</w:t>
+            </w:r>
+          </w:p>
+        </w:tc>
+      </w:tr>
+      <w:tr>
+        <w:tc>
+          <w:tcPr>
+            <w:cnfStyle w:val="001000000000" w:firstRow="0" w:lastRow="0" w:firstColumn="1" w:lastColumn="0" w:oddVBand="0" w:evenVBand="0" w:oddHBand="0" w:evenHBand="0" w:firstRowFirstColumn="0" w:firstRowLastColumn="0" w:lastRowFirstColumn="0" w:lastRowLastColumn="0"/>
+            <w:tcW w:w="1980" w:type="dxa"/>
+          </w:tcPr>
+          <w:p>
+            <w:pPr>
+              <w:jc w:val="center"/>
+              <w:rPr>
+                <w:rFonts w:ascii="Calibri Light" w:hAnsi="Calibri Light"/>
+              </w:rPr>
+            </w:pPr>
+            <w:r>
+              <w:rPr>
+                <w:rFonts w:ascii="Calibri Light" w:hAnsi="Calibri Light"/>
+              </w:rPr>
+              <w:t>72</w:t>
+            </w:r>
+          </w:p>
+        </w:tc>
+        <w:tc>
+          <w:tcPr>
+            <w:tcW w:w="7756" w:type="dxa"/>
+          </w:tcPr>
+          <w:p>
+            <w:pPr>
+              <w:tabs>
+                <w:tab w:val="left" w:pos="3360"/>
+              </w:tabs>
+              <w:cnfStyle w:val="000000000000" w:firstRow="0" w:lastRow="0" w:firstColumn="0" w:lastColumn="0" w:oddVBand="0" w:evenVBand="0" w:oddHBand="0" w:evenHBand="0" w:firstRowFirstColumn="0" w:firstRowLastColumn="0" w:lastRowFirstColumn="0" w:lastRowLastColumn="0"/>
+              <w:rPr>
+                <w:rFonts w:ascii="Calibri Light" w:hAnsi="Calibri Light"/>
+              </w:rPr>
+            </w:pPr>
+            <w:r>
+              <w:rPr>
+                <w:rFonts w:ascii="Calibri Light" w:hAnsi="Calibri Light"/>
+              </w:rPr>
+              <w:t>POWER_INVALID_FORMAT</w:t>
+            </w:r>
+          </w:p>
+        </w:tc>
+      </w:tr>
+      <w:tr>
+        <w:tc>
+          <w:tcPr>
+            <w:cnfStyle w:val="001000000000" w:firstRow="0" w:lastRow="0" w:firstColumn="1" w:lastColumn="0" w:oddVBand="0" w:evenVBand="0" w:oddHBand="0" w:evenHBand="0" w:firstRowFirstColumn="0" w:firstRowLastColumn="0" w:lastRowFirstColumn="0" w:lastRowLastColumn="0"/>
+            <w:tcW w:w="1980" w:type="dxa"/>
+          </w:tcPr>
+          <w:p>
+            <w:pPr>
+              <w:jc w:val="center"/>
+              <w:rPr>
+                <w:rFonts w:ascii="Calibri Light" w:hAnsi="Calibri Light"/>
+              </w:rPr>
+            </w:pPr>
+            <w:r>
+              <w:rPr>
+                <w:rFonts w:ascii="Calibri Light" w:hAnsi="Calibri Light"/>
+              </w:rPr>
+              <w:t>73</w:t>
+            </w:r>
+          </w:p>
+        </w:tc>
+        <w:tc>
+          <w:tcPr>
+            <w:tcW w:w="7756" w:type="dxa"/>
+          </w:tcPr>
+          <w:p>
+            <w:pPr>
+              <w:tabs>
+                <w:tab w:val="left" w:pos="3360"/>
+              </w:tabs>
+              <w:cnfStyle w:val="000000000000" w:firstRow="0" w:lastRow="0" w:firstColumn="0" w:lastColumn="0" w:oddVBand="0" w:evenVBand="0" w:oddHBand="0" w:evenHBand="0" w:firstRowFirstColumn="0" w:firstRowLastColumn="0" w:lastRowFirstColumn="0" w:lastRowLastColumn="0"/>
+              <w:rPr>
+                <w:rFonts w:ascii="Calibri Light" w:hAnsi="Calibri Light"/>
+              </w:rPr>
+            </w:pPr>
+            <w:r>
+              <w:rPr>
+                <w:rFonts w:ascii="Calibri Light" w:hAnsi="Calibri Light"/>
+              </w:rPr>
+              <w:t>TEMPERATURE_INVALID_FORMAT</w:t>
+            </w:r>
+          </w:p>
+        </w:tc>
+      </w:tr>
+      <w:tr>
+        <w:tc>
+          <w:tcPr>
+            <w:cnfStyle w:val="001000000000" w:firstRow="0" w:lastRow="0" w:firstColumn="1" w:lastColumn="0" w:oddVBand="0" w:evenVBand="0" w:oddHBand="0" w:evenHBand="0" w:firstRowFirstColumn="0" w:firstRowLastColumn="0" w:lastRowFirstColumn="0" w:lastRowLastColumn="0"/>
+            <w:tcW w:w="1980" w:type="dxa"/>
+          </w:tcPr>
+          <w:p>
+            <w:pPr>
+              <w:jc w:val="center"/>
+              <w:rPr>
+                <w:rFonts w:ascii="Calibri Light" w:hAnsi="Calibri Light"/>
+              </w:rPr>
+            </w:pPr>
+            <w:r>
+              <w:rPr>
+                <w:rFonts w:ascii="Calibri Light" w:hAnsi="Calibri Light"/>
+              </w:rPr>
+              <w:t>74</w:t>
+            </w:r>
+          </w:p>
+        </w:tc>
+        <w:tc>
+          <w:tcPr>
+            <w:tcW w:w="7756" w:type="dxa"/>
+          </w:tcPr>
+          <w:p>
+            <w:pPr>
+              <w:tabs>
+                <w:tab w:val="left" w:pos="3360"/>
+              </w:tabs>
+              <w:cnfStyle w:val="000000000000" w:firstRow="0" w:lastRow="0" w:firstColumn="0" w:lastColumn="0" w:oddVBand="0" w:evenVBand="0" w:oddHBand="0" w:evenHBand="0" w:firstRowFirstColumn="0" w:firstRowLastColumn="0" w:lastRowFirstColumn="0" w:lastRowLastColumn="0"/>
+              <w:rPr>
+                <w:rFonts w:ascii="Calibri Light" w:hAnsi="Calibri Light"/>
+              </w:rPr>
+            </w:pPr>
+            <w:r>
+              <w:rPr>
+                <w:rFonts w:ascii="Calibri Light" w:hAnsi="Calibri Light"/>
+              </w:rPr>
+              <w:t>FAN</w:t>
+            </w:r>
+            <w:r>
+              <w:rPr>
+                <w:rFonts w:ascii="Calibri Light" w:hAnsi="Calibri Light"/>
+              </w:rPr>
+              <w:t>_SPEED</w:t>
+            </w:r>
+            <w:r>
+              <w:rPr>
+                <w:rFonts w:ascii="Calibri Light" w:hAnsi="Calibri Light"/>
+              </w:rPr>
+              <w:t>_INVALID_FORMAT</w:t>
+            </w:r>
+          </w:p>
+        </w:tc>
+      </w:tr>
+      <w:tr>
+        <w:tc>
+          <w:tcPr>
+            <w:cnfStyle w:val="001000000000" w:firstRow="0" w:lastRow="0" w:firstColumn="1" w:lastColumn="0" w:oddVBand="0" w:evenVBand="0" w:oddHBand="0" w:evenHBand="0" w:firstRowFirstColumn="0" w:firstRowLastColumn="0" w:lastRowFirstColumn="0" w:lastRowLastColumn="0"/>
+            <w:tcW w:w="1980" w:type="dxa"/>
+          </w:tcPr>
+          <w:p>
+            <w:pPr>
+              <w:jc w:val="center"/>
+              <w:rPr>
+                <w:rFonts w:ascii="Calibri Light" w:hAnsi="Calibri Light"/>
+              </w:rPr>
+            </w:pPr>
+            <w:r>
+              <w:rPr>
+                <w:rFonts w:ascii="Calibri Light" w:hAnsi="Calibri Light"/>
+              </w:rPr>
+              <w:t>75</w:t>
+            </w:r>
+          </w:p>
+        </w:tc>
+        <w:tc>
+          <w:tcPr>
+            <w:tcW w:w="7756" w:type="dxa"/>
+          </w:tcPr>
+          <w:p>
+            <w:pPr>
+              <w:tabs>
+                <w:tab w:val="left" w:pos="3360"/>
+              </w:tabs>
+              <w:cnfStyle w:val="000000000000" w:firstRow="0" w:lastRow="0" w:firstColumn="0" w:lastColumn="0" w:oddVBand="0" w:evenVBand="0" w:oddHBand="0" w:evenHBand="0" w:firstRowFirstColumn="0" w:firstRowLastColumn="0" w:lastRowFirstColumn="0" w:lastRowLastColumn="0"/>
+              <w:rPr>
+                <w:rFonts w:ascii="Calibri Light" w:hAnsi="Calibri Light"/>
+              </w:rPr>
+            </w:pPr>
+            <w:r>
+              <w:rPr>
+                <w:rFonts w:ascii="Calibri Light" w:hAnsi="Calibri Light"/>
+              </w:rPr>
+              <w:t>MODE_INVALID_FORMAT</w:t>
+            </w:r>
+          </w:p>
+        </w:tc>
+      </w:tr>
+      <w:tr>
+        <w:tc>
+          <w:tcPr>
+            <w:cnfStyle w:val="001000000000" w:firstRow="0" w:lastRow="0" w:firstColumn="1" w:lastColumn="0" w:oddVBand="0" w:evenVBand="0" w:oddHBand="0" w:evenHBand="0" w:firstRowFirstColumn="0" w:firstRowLastColumn="0" w:lastRowFirstColumn="0" w:lastRowLastColumn="0"/>
+            <w:tcW w:w="1980" w:type="dxa"/>
+          </w:tcPr>
+          <w:p>
+            <w:pPr>
+              <w:jc w:val="center"/>
+              <w:rPr>
+                <w:rFonts w:ascii="Calibri Light" w:hAnsi="Calibri Light"/>
+              </w:rPr>
+            </w:pPr>
+            <w:r>
+              <w:rPr>
+                <w:rFonts w:ascii="Calibri Light" w:hAnsi="Calibri Light"/>
+              </w:rPr>
+              <w:t>76</w:t>
+            </w:r>
+          </w:p>
+        </w:tc>
+        <w:tc>
+          <w:tcPr>
+            <w:tcW w:w="7756" w:type="dxa"/>
+          </w:tcPr>
+          <w:p>
+            <w:pPr>
+              <w:tabs>
+                <w:tab w:val="left" w:pos="3360"/>
+              </w:tabs>
+              <w:cnfStyle w:val="000000000000" w:firstRow="0" w:lastRow="0" w:firstColumn="0" w:lastColumn="0" w:oddVBand="0" w:evenVBand="0" w:oddHBand="0" w:evenHBand="0" w:firstRowFirstColumn="0" w:firstRowLastColumn="0" w:lastRowFirstColumn="0" w:lastRowLastColumn="0"/>
+              <w:rPr>
+                <w:rFonts w:ascii="Calibri Light" w:hAnsi="Calibri Light"/>
+              </w:rPr>
+            </w:pPr>
+            <w:r>
+              <w:rPr>
+                <w:rFonts w:ascii="Calibri Light" w:hAnsi="Calibri Light"/>
+              </w:rPr>
+              <w:t>SWINGH_INVALID_FORMAT</w:t>
+            </w:r>
+          </w:p>
+        </w:tc>
+      </w:tr>
+      <w:tr>
+        <w:tc>
+          <w:tcPr>
+            <w:cnfStyle w:val="001000000000" w:firstRow="0" w:lastRow="0" w:firstColumn="1" w:lastColumn="0" w:oddVBand="0" w:evenVBand="0" w:oddHBand="0" w:evenHBand="0" w:firstRowFirstColumn="0" w:firstRowLastColumn="0" w:lastRowFirstColumn="0" w:lastRowLastColumn="0"/>
+            <w:tcW w:w="1980" w:type="dxa"/>
+          </w:tcPr>
+          <w:p>
+            <w:pPr>
+              <w:jc w:val="center"/>
+              <w:rPr>
+                <w:rFonts w:ascii="Calibri Light" w:hAnsi="Calibri Light"/>
+              </w:rPr>
+            </w:pPr>
+            <w:r>
+              <w:rPr>
+                <w:rFonts w:ascii="Calibri Light" w:hAnsi="Calibri Light"/>
+              </w:rPr>
+              <w:t>77</w:t>
+            </w:r>
+          </w:p>
+        </w:tc>
+        <w:tc>
+          <w:tcPr>
+            <w:tcW w:w="7756" w:type="dxa"/>
+          </w:tcPr>
+          <w:p>
+            <w:pPr>
+              <w:tabs>
+                <w:tab w:val="left" w:pos="3360"/>
+              </w:tabs>
+              <w:cnfStyle w:val="000000000000" w:firstRow="0" w:lastRow="0" w:firstColumn="0" w:lastColumn="0" w:oddVBand="0" w:evenVBand="0" w:oddHBand="0" w:evenHBand="0" w:firstRowFirstColumn="0" w:firstRowLastColumn="0" w:lastRowFirstColumn="0" w:lastRowLastColumn="0"/>
+              <w:rPr>
+                <w:rFonts w:ascii="Calibri Light" w:hAnsi="Calibri Light"/>
+              </w:rPr>
+            </w:pPr>
+            <w:r>
+              <w:rPr>
+                <w:rFonts w:ascii="Calibri Light" w:hAnsi="Calibri Light"/>
+              </w:rPr>
+              <w:t>SWINGV_INVALID_FORMAT</w:t>
+            </w:r>
+          </w:p>
+        </w:tc>
+      </w:tr>
+      <w:tr>
+        <w:tc>
+          <w:tcPr>
+            <w:cnfStyle w:val="001000000000" w:firstRow="0" w:lastRow="0" w:firstColumn="1" w:lastColumn="0" w:oddVBand="0" w:evenVBand="0" w:oddHBand="0" w:evenHBand="0" w:firstRowFirstColumn="0" w:firstRowLastColumn="0" w:lastRowFirstColumn="0" w:lastRowLastColumn="0"/>
+            <w:tcW w:w="1980" w:type="dxa"/>
+          </w:tcPr>
+          <w:p>
+            <w:pPr>
+              <w:jc w:val="center"/>
+              <w:rPr>
+                <w:rFonts w:ascii="Calibri Light" w:hAnsi="Calibri Light"/>
+              </w:rPr>
+            </w:pPr>
+            <w:r>
+              <w:rPr>
+                <w:rFonts w:ascii="Calibri Light" w:hAnsi="Calibri Light"/>
+              </w:rPr>
+              <w:t>78</w:t>
+            </w:r>
+          </w:p>
+        </w:tc>
+        <w:tc>
+          <w:tcPr>
+            <w:tcW w:w="7756" w:type="dxa"/>
+          </w:tcPr>
+          <w:p>
+            <w:pPr>
+              <w:tabs>
+                <w:tab w:val="left" w:pos="3360"/>
+              </w:tabs>
+              <w:cnfStyle w:val="000000000000" w:firstRow="0" w:lastRow="0" w:firstColumn="0" w:lastColumn="0" w:oddVBand="0" w:evenVBand="0" w:oddHBand="0" w:evenHBand="0" w:firstRowFirstColumn="0" w:firstRowLastColumn="0" w:lastRowFirstColumn="0" w:lastRowLastColumn="0"/>
+              <w:rPr>
+                <w:rFonts w:ascii="Calibri Light" w:hAnsi="Calibri Light"/>
+              </w:rPr>
+            </w:pPr>
+            <w:r>
+              <w:rPr>
+                <w:rFonts w:ascii="Calibri Light" w:hAnsi="Calibri Light"/>
+              </w:rPr>
+              <w:t>LOCKING_INVALID_FORMAT</w:t>
+            </w:r>
+          </w:p>
+        </w:tc>
+      </w:tr>
+      <w:tr>
+        <w:tc>
+          <w:tcPr>
+            <w:cnfStyle w:val="001000000000" w:firstRow="0" w:lastRow="0" w:firstColumn="1" w:lastColumn="0" w:oddVBand="0" w:evenVBand="0" w:oddHBand="0" w:evenHBand="0" w:firstRowFirstColumn="0" w:firstRowLastColumn="0" w:lastRowFirstColumn="0" w:lastRowLastColumn="0"/>
+            <w:tcW w:w="1980" w:type="dxa"/>
+          </w:tcPr>
+          <w:p>
+            <w:pPr>
+              <w:jc w:val="center"/>
+              <w:rPr>
+                <w:rFonts w:ascii="Calibri Light" w:hAnsi="Calibri Light"/>
+              </w:rPr>
+            </w:pPr>
+            <w:r>
+              <w:rPr>
+                <w:rFonts w:ascii="Calibri Light" w:hAnsi="Calibri Light"/>
+              </w:rPr>
+              <w:t>79</w:t>
+            </w:r>
+          </w:p>
+        </w:tc>
+        <w:tc>
+          <w:tcPr>
+            <w:tcW w:w="7756" w:type="dxa"/>
+          </w:tcPr>
+          <w:p>
+            <w:pPr>
+              <w:tabs>
+                <w:tab w:val="left" w:pos="3360"/>
+              </w:tabs>
+              <w:cnfStyle w:val="000000000000" w:firstRow="0" w:lastRow="0" w:firstColumn="0" w:lastColumn="0" w:oddVBand="0" w:evenVBand="0" w:oddHBand="0" w:evenHBand="0" w:firstRowFirstColumn="0" w:firstRowLastColumn="0" w:lastRowFirstColumn="0" w:lastRowLastColumn="0"/>
+              <w:rPr>
+                <w:rFonts w:ascii="Calibri Light" w:hAnsi="Calibri Light"/>
+              </w:rPr>
+            </w:pPr>
+            <w:r>
+              <w:rPr>
+                <w:rFonts w:ascii="Calibri Light" w:hAnsi="Calibri Light"/>
+              </w:rPr>
+              <w:t>ONTIMER_INVALID_FORMAT</w:t>
+            </w:r>
+          </w:p>
+        </w:tc>
+      </w:tr>
+      <w:tr>
+        <w:tc>
+          <w:tcPr>
+            <w:cnfStyle w:val="001000000000" w:firstRow="0" w:lastRow="0" w:firstColumn="1" w:lastColumn="0" w:oddVBand="0" w:evenVBand="0" w:oddHBand="0" w:evenHBand="0" w:firstRowFirstColumn="0" w:firstRowLastColumn="0" w:lastRowFirstColumn="0" w:lastRowLastColumn="0"/>
+            <w:tcW w:w="1980" w:type="dxa"/>
+          </w:tcPr>
+          <w:p>
+            <w:pPr>
+              <w:jc w:val="center"/>
+              <w:rPr>
+                <w:rFonts w:ascii="Calibri Light" w:hAnsi="Calibri Light"/>
+              </w:rPr>
+            </w:pPr>
+            <w:r>
+              <w:rPr>
+                <w:rFonts w:ascii="Calibri Light" w:hAnsi="Calibri Light"/>
+              </w:rPr>
+              <w:t>80</w:t>
+            </w:r>
+          </w:p>
+        </w:tc>
+        <w:tc>
+          <w:tcPr>
+            <w:tcW w:w="7756" w:type="dxa"/>
+          </w:tcPr>
+          <w:p>
+            <w:pPr>
+              <w:tabs>
+                <w:tab w:val="left" w:pos="3360"/>
+              </w:tabs>
+              <w:cnfStyle w:val="000000000000" w:firstRow="0" w:lastRow="0" w:firstColumn="0" w:lastColumn="0" w:oddVBand="0" w:evenVBand="0" w:oddHBand="0" w:evenHBand="0" w:firstRowFirstColumn="0" w:firstRowLastColumn="0" w:lastRowFirstColumn="0" w:lastRowLastColumn="0"/>
+              <w:rPr>
+                <w:rFonts w:ascii="Calibri Light" w:hAnsi="Calibri Light"/>
+              </w:rPr>
+            </w:pPr>
+            <w:r>
+              <w:rPr>
+                <w:rFonts w:ascii="Calibri Light" w:hAnsi="Calibri Light"/>
+              </w:rPr>
+              <w:t>OFFTIMER_INVALID_FORMAT</w:t>
+            </w:r>
+          </w:p>
+        </w:tc>
+      </w:tr>
+      <w:tr>
+        <w:tc>
+          <w:tcPr>
+            <w:cnfStyle w:val="001000000000" w:firstRow="0" w:lastRow="0" w:firstColumn="1" w:lastColumn="0" w:oddVBand="0" w:evenVBand="0" w:oddHBand="0" w:evenHBand="0" w:firstRowFirstColumn="0" w:firstRowLastColumn="0" w:lastRowFirstColumn="0" w:lastRowLastColumn="0"/>
+            <w:tcW w:w="1980" w:type="dxa"/>
+          </w:tcPr>
+          <w:p>
+            <w:pPr>
+              <w:jc w:val="center"/>
+              <w:rPr>
+                <w:rFonts w:ascii="Calibri Light" w:hAnsi="Calibri Light"/>
+              </w:rPr>
+            </w:pPr>
+            <w:r>
+              <w:rPr>
+                <w:rFonts w:ascii="Calibri Light" w:hAnsi="Calibri Light"/>
+              </w:rPr>
+              <w:t>81</w:t>
+            </w:r>
+          </w:p>
+        </w:tc>
+        <w:tc>
+          <w:tcPr>
+            <w:tcW w:w="7756" w:type="dxa"/>
+          </w:tcPr>
+          <w:p>
+            <w:pPr>
+              <w:tabs>
+                <w:tab w:val="left" w:pos="3360"/>
+              </w:tabs>
+              <w:cnfStyle w:val="000000000000" w:firstRow="0" w:lastRow="0" w:firstColumn="0" w:lastColumn="0" w:oddVBand="0" w:evenVBand="0" w:oddHBand="0" w:evenHBand="0" w:firstRowFirstColumn="0" w:firstRowLastColumn="0" w:lastRowFirstColumn="0" w:lastRowLastColumn="0"/>
+              <w:rPr>
+                <w:rFonts w:ascii="Calibri Light" w:hAnsi="Calibri Light"/>
+              </w:rPr>
+            </w:pPr>
+            <w:r>
+              <w:rPr>
+                <w:rFonts w:ascii="Calibri Light" w:hAnsi="Calibri Light"/>
+              </w:rPr>
+              <w:t>TEMPERATURE_UPPER_LIMIT_INVALID_FORMAT</w:t>
+            </w:r>
+          </w:p>
+        </w:tc>
+      </w:tr>
+      <w:tr>
+        <w:tc>
+          <w:tcPr>
+            <w:cnfStyle w:val="001000000000" w:firstRow="0" w:lastRow="0" w:firstColumn="1" w:lastColumn="0" w:oddVBand="0" w:evenVBand="0" w:oddHBand="0" w:evenHBand="0" w:firstRowFirstColumn="0" w:firstRowLastColumn="0" w:lastRowFirstColumn="0" w:lastRowLastColumn="0"/>
+            <w:tcW w:w="1980" w:type="dxa"/>
+          </w:tcPr>
+          <w:p>
+            <w:pPr>
+              <w:jc w:val="center"/>
+              <w:rPr>
+                <w:rFonts w:ascii="Calibri Light" w:hAnsi="Calibri Light"/>
+              </w:rPr>
+            </w:pPr>
+            <w:r>
+              <w:rPr>
+                <w:rFonts w:ascii="Calibri Light" w:hAnsi="Calibri Light"/>
+              </w:rPr>
+              <w:t>82</w:t>
+            </w:r>
+          </w:p>
+        </w:tc>
+        <w:tc>
+          <w:tcPr>
+            <w:tcW w:w="7756" w:type="dxa"/>
+          </w:tcPr>
+          <w:p>
+            <w:pPr>
+              <w:tabs>
+                <w:tab w:val="left" w:pos="3360"/>
+              </w:tabs>
+              <w:cnfStyle w:val="000000000000" w:firstRow="0" w:lastRow="0" w:firstColumn="0" w:lastColumn="0" w:oddVBand="0" w:evenVBand="0" w:oddHBand="0" w:evenHBand="0" w:firstRowFirstColumn="0" w:firstRowLastColumn="0" w:lastRowFirstColumn="0" w:lastRowLastColumn="0"/>
+              <w:rPr>
+                <w:rFonts w:ascii="Calibri Light" w:hAnsi="Calibri Light"/>
+              </w:rPr>
+            </w:pPr>
+            <w:r>
+              <w:rPr>
+                <w:rFonts w:ascii="Calibri Light" w:hAnsi="Calibri Light"/>
+              </w:rPr>
+              <w:t>TEMPERATURE_LOWER_LIMIT_INVALID_FORMAT</w:t>
+            </w:r>
+          </w:p>
+        </w:tc>
+      </w:tr>
+      <w:tr>
+        <w:tc>
+          <w:tcPr>
+            <w:cnfStyle w:val="001000000000" w:firstRow="0" w:lastRow="0" w:firstColumn="1" w:lastColumn="0" w:oddVBand="0" w:evenVBand="0" w:oddHBand="0" w:evenHBand="0" w:firstRowFirstColumn="0" w:firstRowLastColumn="0" w:lastRowFirstColumn="0" w:lastRowLastColumn="0"/>
+            <w:tcW w:w="1980" w:type="dxa"/>
+          </w:tcPr>
+          <w:p>
+            <w:pPr>
+              <w:jc w:val="center"/>
+              <w:rPr>
+                <w:rFonts w:ascii="Calibri Light" w:hAnsi="Calibri Light"/>
+              </w:rPr>
+            </w:pPr>
+            <w:r>
+              <w:rPr>
+                <w:rFonts w:ascii="Calibri Light" w:hAnsi="Calibri Light"/>
+              </w:rPr>
+              <w:t>83</w:t>
+            </w:r>
+          </w:p>
+        </w:tc>
+        <w:tc>
+          <w:tcPr>
+            <w:tcW w:w="7756" w:type="dxa"/>
+          </w:tcPr>
+          <w:p>
+            <w:pPr>
+              <w:tabs>
+                <w:tab w:val="left" w:pos="3360"/>
+              </w:tabs>
+              <w:cnfStyle w:val="000000000000" w:firstRow="0" w:lastRow="0" w:firstColumn="0" w:lastColumn="0" w:oddVBand="0" w:evenVBand="0" w:oddHBand="0" w:evenHBand="0" w:firstRowFirstColumn="0" w:firstRowLastColumn="0" w:lastRowFirstColumn="0" w:lastRowLastColumn="0"/>
+              <w:rPr>
+                <w:rFonts w:ascii="Calibri Light" w:hAnsi="Calibri Light"/>
+              </w:rPr>
+            </w:pPr>
+            <w:r>
+              <w:rPr>
+                <w:rFonts w:ascii="Calibri Light" w:hAnsi="Calibri Light"/>
+              </w:rPr>
+              <w:t>PACKETID_INVALID_FORMAT</w:t>
+            </w:r>
+          </w:p>
+        </w:tc>
+      </w:tr>
+      <w:tr>
+        <w:tc>
+          <w:tcPr>
+            <w:cnfStyle w:val="001000000000" w:firstRow="0" w:lastRow="0" w:firstColumn="1" w:lastColumn="0" w:oddVBand="0" w:evenVBand="0" w:oddHBand="0" w:evenHBand="0" w:firstRowFirstColumn="0" w:firstRowLastColumn="0" w:lastRowFirstColumn="0" w:lastRowLastColumn="0"/>
+            <w:tcW w:w="1980" w:type="dxa"/>
+          </w:tcPr>
+          <w:p>
+            <w:pPr>
+              <w:jc w:val="center"/>
+              <w:rPr>
+                <w:rFonts w:ascii="Calibri Light" w:hAnsi="Calibri Light"/>
+              </w:rPr>
+            </w:pPr>
+            <w:r>
+              <w:rPr>
+                <w:rFonts w:ascii="Calibri Light" w:hAnsi="Calibri Light"/>
+              </w:rPr>
+              <w:t>84</w:t>
+            </w:r>
+          </w:p>
+        </w:tc>
+        <w:tc>
+          <w:tcPr>
+            <w:tcW w:w="7756" w:type="dxa"/>
+          </w:tcPr>
+          <w:p>
+            <w:pPr>
+              <w:tabs>
+                <w:tab w:val="left" w:pos="3360"/>
+              </w:tabs>
+              <w:cnfStyle w:val="000000000000" w:firstRow="0" w:lastRow="0" w:firstColumn="0" w:lastColumn="0" w:oddVBand="0" w:evenVBand="0" w:oddHBand="0" w:evenHBand="0" w:firstRowFirstColumn="0" w:firstRowLastColumn="0" w:lastRowFirstColumn="0" w:lastRowLastColumn="0"/>
+              <w:rPr>
+                <w:rFonts w:ascii="Calibri Light" w:hAnsi="Calibri Light"/>
+              </w:rPr>
+            </w:pPr>
+            <w:r>
+              <w:rPr>
+                <w:rFonts w:ascii="Calibri Light" w:hAnsi="Calibri Light"/>
+              </w:rPr>
+              <w:t>MSG_SEQ_NO_INVALID_FORMAT</w:t>
+            </w:r>
+          </w:p>
+        </w:tc>
+      </w:tr>
+      <w:tr>
+        <w:tc>
+          <w:tcPr>
+            <w:cnfStyle w:val="001000000000" w:firstRow="0" w:lastRow="0" w:firstColumn="1" w:lastColumn="0" w:oddVBand="0" w:evenVBand="0" w:oddHBand="0" w:evenHBand="0" w:firstRowFirstColumn="0" w:firstRowLastColumn="0" w:lastRowFirstColumn="0" w:lastRowLastColumn="0"/>
+            <w:tcW w:w="1980" w:type="dxa"/>
+          </w:tcPr>
+          <w:p>
+            <w:pPr>
+              <w:jc w:val="center"/>
+              <w:rPr>
+                <w:rFonts w:ascii="Calibri Light" w:hAnsi="Calibri Light"/>
+              </w:rPr>
+            </w:pPr>
+            <w:r>
+              <w:rPr>
+                <w:rFonts w:ascii="Calibri Light" w:hAnsi="Calibri Light"/>
+              </w:rPr>
+              <w:lastRenderedPageBreak/>
+              <w:t>85</w:t>
+            </w:r>
+          </w:p>
+        </w:tc>
+        <w:tc>
+          <w:tcPr>
+            <w:tcW w:w="7756" w:type="dxa"/>
+          </w:tcPr>
+          <w:p>
+            <w:pPr>
+              <w:tabs>
+                <w:tab w:val="left" w:pos="3360"/>
+              </w:tabs>
+              <w:cnfStyle w:val="000000000000" w:firstRow="0" w:lastRow="0" w:firstColumn="0" w:lastColumn="0" w:oddVBand="0" w:evenVBand="0" w:oddHBand="0" w:evenHBand="0" w:firstRowFirstColumn="0" w:firstRowLastColumn="0" w:lastRowFirstColumn="0" w:lastRowLastColumn="0"/>
+              <w:rPr>
+                <w:rFonts w:ascii="Calibri Light" w:hAnsi="Calibri Light"/>
+              </w:rPr>
+            </w:pPr>
+            <w:r>
+              <w:rPr>
+                <w:rFonts w:ascii="Calibri Light" w:hAnsi="Calibri Light"/>
+              </w:rPr>
+              <w:t>ELEMENT_ADDR_INVALID_FORMAT</w:t>
+            </w:r>
+          </w:p>
+        </w:tc>
+      </w:tr>
+      <w:tr>
+        <w:tc>
+          <w:tcPr>
+            <w:cnfStyle w:val="001000000000" w:firstRow="0" w:lastRow="0" w:firstColumn="1" w:lastColumn="0" w:oddVBand="0" w:evenVBand="0" w:oddHBand="0" w:evenHBand="0" w:firstRowFirstColumn="0" w:firstRowLastColumn="0" w:lastRowFirstColumn="0" w:lastRowLastColumn="0"/>
+            <w:tcW w:w="1980" w:type="dxa"/>
+          </w:tcPr>
+          <w:p>
+            <w:pPr>
+              <w:jc w:val="center"/>
+              <w:rPr>
+                <w:rFonts w:ascii="Calibri Light" w:hAnsi="Calibri Light"/>
+              </w:rPr>
+            </w:pPr>
+            <w:r>
+              <w:rPr>
+                <w:rFonts w:ascii="Calibri Light" w:hAnsi="Calibri Light"/>
+              </w:rPr>
+              <w:t>86</w:t>
+            </w:r>
+          </w:p>
+        </w:tc>
+        <w:tc>
+          <w:tcPr>
+            <w:tcW w:w="7756" w:type="dxa"/>
+          </w:tcPr>
+          <w:p>
+            <w:pPr>
+              <w:tabs>
+                <w:tab w:val="left" w:pos="3360"/>
+              </w:tabs>
+              <w:cnfStyle w:val="000000000000" w:firstRow="0" w:lastRow="0" w:firstColumn="0" w:lastColumn="0" w:oddVBand="0" w:evenVBand="0" w:oddHBand="0" w:evenHBand="0" w:firstRowFirstColumn="0" w:firstRowLastColumn="0" w:lastRowFirstColumn="0" w:lastRowLastColumn="0"/>
+              <w:rPr>
+                <w:rFonts w:ascii="Calibri Light" w:hAnsi="Calibri Light"/>
+              </w:rPr>
+            </w:pPr>
+            <w:r>
+              <w:rPr>
+                <w:rFonts w:ascii="Calibri Light" w:hAnsi="Calibri Light"/>
+              </w:rPr>
+              <w:t>LOCATION_INVALID_FORMAT</w:t>
+            </w:r>
+          </w:p>
+        </w:tc>
+      </w:tr>
+      <w:tr>
+        <w:tc>
+          <w:tcPr>
+            <w:cnfStyle w:val="001000000000" w:firstRow="0" w:lastRow="0" w:firstColumn="1" w:lastColumn="0" w:oddVBand="0" w:evenVBand="0" w:oddHBand="0" w:evenHBand="0" w:firstRowFirstColumn="0" w:firstRowLastColumn="0" w:lastRowFirstColumn="0" w:lastRowLastColumn="0"/>
+            <w:tcW w:w="1980" w:type="dxa"/>
+          </w:tcPr>
+          <w:p>
+            <w:pPr>
+              <w:jc w:val="center"/>
+              <w:rPr>
+                <w:rFonts w:ascii="Calibri Light" w:hAnsi="Calibri Light"/>
+              </w:rPr>
+            </w:pPr>
+            <w:r>
+              <w:rPr>
+                <w:rFonts w:ascii="Calibri Light" w:hAnsi="Calibri Light"/>
+              </w:rPr>
+              <w:t>87</w:t>
+            </w:r>
+          </w:p>
+        </w:tc>
+        <w:tc>
+          <w:tcPr>
+            <w:tcW w:w="7756" w:type="dxa"/>
+          </w:tcPr>
+          <w:p>
+            <w:pPr>
+              <w:tabs>
+                <w:tab w:val="left" w:pos="3360"/>
+              </w:tabs>
+              <w:cnfStyle w:val="000000000000" w:firstRow="0" w:lastRow="0" w:firstColumn="0" w:lastColumn="0" w:oddVBand="0" w:evenVBand="0" w:oddHBand="0" w:evenHBand="0" w:firstRowFirstColumn="0" w:firstRowLastColumn="0" w:lastRowFirstColumn="0" w:lastRowLastColumn="0"/>
+              <w:rPr>
+                <w:rFonts w:ascii="Calibri Light" w:hAnsi="Calibri Light"/>
+              </w:rPr>
+            </w:pPr>
+            <w:r>
+              <w:rPr>
+                <w:rFonts w:ascii="Calibri Light" w:hAnsi="Calibri Light"/>
+              </w:rPr>
+              <w:t>PUBLISH_PERIOD_INVALID_FORMAT</w:t>
+            </w:r>
+          </w:p>
+        </w:tc>
+      </w:tr>
+      <w:tr>
+        <w:tc>
+          <w:tcPr>
+            <w:cnfStyle w:val="001000000000" w:firstRow="0" w:lastRow="0" w:firstColumn="1" w:lastColumn="0" w:oddVBand="0" w:evenVBand="0" w:oddHBand="0" w:evenHBand="0" w:firstRowFirstColumn="0" w:firstRowLastColumn="0" w:lastRowFirstColumn="0" w:lastRowLastColumn="0"/>
+            <w:tcW w:w="1980" w:type="dxa"/>
+          </w:tcPr>
+          <w:p>
+            <w:pPr>
+              <w:jc w:val="center"/>
+              <w:rPr>
+                <w:rFonts w:ascii="Calibri Light" w:hAnsi="Calibri Light"/>
+              </w:rPr>
+            </w:pPr>
+            <w:r>
+              <w:rPr>
+                <w:rFonts w:ascii="Calibri Light" w:hAnsi="Calibri Light"/>
+              </w:rPr>
+              <w:t>88</w:t>
+            </w:r>
+          </w:p>
+        </w:tc>
+        <w:tc>
+          <w:tcPr>
+            <w:tcW w:w="7756" w:type="dxa"/>
+          </w:tcPr>
+          <w:p>
+            <w:pPr>
+              <w:tabs>
+                <w:tab w:val="left" w:pos="3360"/>
+              </w:tabs>
+              <w:cnfStyle w:val="000000000000" w:firstRow="0" w:lastRow="0" w:firstColumn="0" w:lastColumn="0" w:oddVBand="0" w:evenVBand="0" w:oddHBand="0" w:evenHBand="0" w:firstRowFirstColumn="0" w:firstRowLastColumn="0" w:lastRowFirstColumn="0" w:lastRowLastColumn="0"/>
+              <w:rPr>
+                <w:rFonts w:ascii="Calibri Light" w:hAnsi="Calibri Light"/>
+              </w:rPr>
+            </w:pPr>
+            <w:r>
+              <w:rPr>
+                <w:rFonts w:ascii="Calibri Light" w:hAnsi="Calibri Light"/>
+              </w:rPr>
+              <w:t>MACID_INVALID_FORMAT</w:t>
+            </w:r>
+          </w:p>
+        </w:tc>
+      </w:tr>
+      <w:tr>
+        <w:tc>
+          <w:tcPr>
+            <w:cnfStyle w:val="001000000000" w:firstRow="0" w:lastRow="0" w:firstColumn="1" w:lastColumn="0" w:oddVBand="0" w:evenVBand="0" w:oddHBand="0" w:evenHBand="0" w:firstRowFirstColumn="0" w:firstRowLastColumn="0" w:lastRowFirstColumn="0" w:lastRowLastColumn="0"/>
+            <w:tcW w:w="1980" w:type="dxa"/>
+          </w:tcPr>
+          <w:p>
+            <w:pPr>
+              <w:jc w:val="center"/>
+              <w:rPr>
+                <w:rFonts w:ascii="Calibri Light" w:hAnsi="Calibri Light"/>
+              </w:rPr>
+            </w:pPr>
+            <w:r>
+              <w:rPr>
+                <w:rFonts w:ascii="Calibri Light" w:hAnsi="Calibri Light"/>
+              </w:rPr>
+              <w:t>89</w:t>
+            </w:r>
+          </w:p>
+        </w:tc>
+        <w:tc>
+          <w:tcPr>
+            <w:tcW w:w="7756" w:type="dxa"/>
+          </w:tcPr>
+          <w:p>
+            <w:pPr>
+              <w:tabs>
+                <w:tab w:val="left" w:pos="3360"/>
+              </w:tabs>
+              <w:cnfStyle w:val="000000000000" w:firstRow="0" w:lastRow="0" w:firstColumn="0" w:lastColumn="0" w:oddVBand="0" w:evenVBand="0" w:oddHBand="0" w:evenHBand="0" w:firstRowFirstColumn="0" w:firstRowLastColumn="0" w:lastRowFirstColumn="0" w:lastRowLastColumn="0"/>
+              <w:rPr>
+                <w:rFonts w:ascii="Calibri Light" w:hAnsi="Calibri Light"/>
+              </w:rPr>
+            </w:pPr>
+            <w:r>
+              <w:rPr>
+                <w:rFonts w:ascii="Calibri Light" w:hAnsi="Calibri Light"/>
+              </w:rPr>
+              <w:t>TEACHING_START_INVALID_FORMAT</w:t>
+            </w:r>
+          </w:p>
+        </w:tc>
+      </w:tr>
+      <w:tr>
+        <w:tc>
+          <w:tcPr>
+            <w:cnfStyle w:val="001000000000" w:firstRow="0" w:lastRow="0" w:firstColumn="1" w:lastColumn="0" w:oddVBand="0" w:evenVBand="0" w:oddHBand="0" w:evenHBand="0" w:firstRowFirstColumn="0" w:firstRowLastColumn="0" w:lastRowFirstColumn="0" w:lastRowLastColumn="0"/>
+            <w:tcW w:w="1980" w:type="dxa"/>
+          </w:tcPr>
+          <w:p>
+            <w:pPr>
+              <w:jc w:val="center"/>
+              <w:rPr>
+                <w:rFonts w:ascii="Calibri Light" w:hAnsi="Calibri Light"/>
+              </w:rPr>
+            </w:pPr>
+            <w:r>
+              <w:rPr>
+                <w:rFonts w:ascii="Calibri Light" w:hAnsi="Calibri Light"/>
+              </w:rPr>
+              <w:t>90</w:t>
+            </w:r>
+          </w:p>
+        </w:tc>
+        <w:tc>
+          <w:tcPr>
+            <w:tcW w:w="7756" w:type="dxa"/>
+          </w:tcPr>
+          <w:p>
+            <w:pPr>
+              <w:tabs>
+                <w:tab w:val="left" w:pos="3360"/>
+              </w:tabs>
+              <w:cnfStyle w:val="000000000000" w:firstRow="0" w:lastRow="0" w:firstColumn="0" w:lastColumn="0" w:oddVBand="0" w:evenVBand="0" w:oddHBand="0" w:evenHBand="0" w:firstRowFirstColumn="0" w:firstRowLastColumn="0" w:lastRowFirstColumn="0" w:lastRowLastColumn="0"/>
+              <w:rPr>
+                <w:rFonts w:ascii="Calibri Light" w:hAnsi="Calibri Light"/>
+              </w:rPr>
+            </w:pPr>
+            <w:r>
+              <w:rPr>
+                <w:rFonts w:ascii="Calibri Light" w:hAnsi="Calibri Light"/>
+              </w:rPr>
+              <w:t>STARTING_TEMPERATURE_INVALID_FORMAT</w:t>
+            </w:r>
+          </w:p>
+        </w:tc>
+      </w:tr>
+      <w:tr>
+        <w:tc>
+          <w:tcPr>
+            <w:cnfStyle w:val="001000000000" w:firstRow="0" w:lastRow="0" w:firstColumn="1" w:lastColumn="0" w:oddVBand="0" w:evenVBand="0" w:oddHBand="0" w:evenHBand="0" w:firstRowFirstColumn="0" w:firstRowLastColumn="0" w:lastRowFirstColumn="0" w:lastRowLastColumn="0"/>
+            <w:tcW w:w="1980" w:type="dxa"/>
+          </w:tcPr>
+          <w:p>
+            <w:pPr>
+              <w:jc w:val="center"/>
+              <w:rPr>
+                <w:rFonts w:ascii="Calibri Light" w:hAnsi="Calibri Light"/>
+              </w:rPr>
+            </w:pPr>
+            <w:r>
+              <w:rPr>
+                <w:rFonts w:ascii="Calibri Light" w:hAnsi="Calibri Light"/>
+              </w:rPr>
+              <w:t>91</w:t>
+            </w:r>
+          </w:p>
+        </w:tc>
+        <w:tc>
+          <w:tcPr>
+            <w:tcW w:w="7756" w:type="dxa"/>
+          </w:tcPr>
+          <w:p>
+            <w:pPr>
+              <w:tabs>
+                <w:tab w:val="left" w:pos="3360"/>
+              </w:tabs>
+              <w:cnfStyle w:val="000000000000" w:firstRow="0" w:lastRow="0" w:firstColumn="0" w:lastColumn="0" w:oddVBand="0" w:evenVBand="0" w:oddHBand="0" w:evenHBand="0" w:firstRowFirstColumn="0" w:firstRowLastColumn="0" w:lastRowFirstColumn="0" w:lastRowLastColumn="0"/>
+              <w:rPr>
+                <w:rFonts w:ascii="Calibri Light" w:hAnsi="Calibri Light"/>
+              </w:rPr>
+            </w:pPr>
+            <w:r>
+              <w:rPr>
+                <w:rFonts w:ascii="Calibri Light" w:hAnsi="Calibri Light"/>
+              </w:rPr>
+              <w:t>ENDING_TEMPERATURE_INVALID_FORMAT</w:t>
+            </w:r>
+          </w:p>
+        </w:tc>
+      </w:tr>
+      <w:tr>
+        <w:tc>
+          <w:tcPr>
+            <w:cnfStyle w:val="001000000000" w:firstRow="0" w:lastRow="0" w:firstColumn="1" w:lastColumn="0" w:oddVBand="0" w:evenVBand="0" w:oddHBand="0" w:evenHBand="0" w:firstRowFirstColumn="0" w:firstRowLastColumn="0" w:lastRowFirstColumn="0" w:lastRowLastColumn="0"/>
+            <w:tcW w:w="1980" w:type="dxa"/>
+          </w:tcPr>
+          <w:p>
+            <w:pPr>
+              <w:jc w:val="center"/>
+              <w:rPr>
+                <w:rFonts w:ascii="Calibri Light" w:hAnsi="Calibri Light"/>
+              </w:rPr>
+            </w:pPr>
+            <w:r>
+              <w:rPr>
+                <w:rFonts w:ascii="Calibri Light" w:hAnsi="Calibri Light"/>
+              </w:rPr>
+              <w:t>92</w:t>
+            </w:r>
+          </w:p>
+        </w:tc>
+        <w:tc>
+          <w:tcPr>
+            <w:tcW w:w="7756" w:type="dxa"/>
+          </w:tcPr>
+          <w:p>
+            <w:pPr>
+              <w:tabs>
+                <w:tab w:val="left" w:pos="3360"/>
+              </w:tabs>
+              <w:cnfStyle w:val="000000000000" w:firstRow="0" w:lastRow="0" w:firstColumn="0" w:lastColumn="0" w:oddVBand="0" w:evenVBand="0" w:oddHBand="0" w:evenHBand="0" w:firstRowFirstColumn="0" w:firstRowLastColumn="0" w:lastRowFirstColumn="0" w:lastRowLastColumn="0"/>
+              <w:rPr>
+                <w:rFonts w:ascii="Calibri Light" w:hAnsi="Calibri Light"/>
+              </w:rPr>
+            </w:pPr>
+            <w:r>
+              <w:rPr>
+                <w:rFonts w:ascii="Calibri Light" w:hAnsi="Calibri Light"/>
+              </w:rPr>
+              <w:t>RESTART_INVALID_FORMAT</w:t>
+            </w:r>
+          </w:p>
+        </w:tc>
+      </w:tr>
+      <w:tr>
+        <w:tc>
+          <w:tcPr>
+            <w:cnfStyle w:val="001000000000" w:firstRow="0" w:lastRow="0" w:firstColumn="1" w:lastColumn="0" w:oddVBand="0" w:evenVBand="0" w:oddHBand="0" w:evenHBand="0" w:firstRowFirstColumn="0" w:firstRowLastColumn="0" w:lastRowFirstColumn="0" w:lastRowLastColumn="0"/>
+            <w:tcW w:w="1980" w:type="dxa"/>
+          </w:tcPr>
+          <w:p>
+            <w:pPr>
+              <w:jc w:val="center"/>
+              <w:rPr>
+                <w:rFonts w:ascii="Calibri Light" w:hAnsi="Calibri Light"/>
+              </w:rPr>
+            </w:pPr>
+            <w:r>
+              <w:rPr>
+                <w:rFonts w:ascii="Calibri Light" w:hAnsi="Calibri Light"/>
+              </w:rPr>
+              <w:t>93</w:t>
+            </w:r>
+          </w:p>
+        </w:tc>
+        <w:tc>
+          <w:tcPr>
+            <w:tcW w:w="7756" w:type="dxa"/>
+          </w:tcPr>
+          <w:p>
+            <w:pPr>
+              <w:tabs>
+                <w:tab w:val="left" w:pos="3360"/>
+              </w:tabs>
+              <w:cnfStyle w:val="000000000000" w:firstRow="0" w:lastRow="0" w:firstColumn="0" w:lastColumn="0" w:oddVBand="0" w:evenVBand="0" w:oddHBand="0" w:evenHBand="0" w:firstRowFirstColumn="0" w:firstRowLastColumn="0" w:lastRowFirstColumn="0" w:lastRowLastColumn="0"/>
+              <w:rPr>
+                <w:rFonts w:ascii="Calibri Light" w:hAnsi="Calibri Light"/>
+              </w:rPr>
+            </w:pPr>
+            <w:r>
+              <w:rPr>
+                <w:rFonts w:ascii="Calibri Light" w:hAnsi="Calibri Light"/>
+              </w:rPr>
+              <w:t>RESET_INVALID_FORMAT</w:t>
             </w:r>
           </w:p>
         </w:tc>
@@ -17669,7 +18910,6 @@
               <w:rPr>
                 <w:rFonts w:ascii="Calibri Light" w:hAnsi="Calibri Light"/>
               </w:rPr>
-              <w:lastRenderedPageBreak/>
               <w:t>&lt;GwySerNo&gt;/message</w:t>
             </w:r>
           </w:p>
@@ -17859,6 +19099,7 @@
         <w:pStyle w:val="Heading2"/>
       </w:pPr>
       <w:r>
+        <w:lastRenderedPageBreak/>
         <w:t>Teaching Mode with Error Check</w:t>
       </w:r>
     </w:p>
@@ -17939,13 +19180,7 @@
         <w:pStyle w:val="Heading2"/>
       </w:pPr>
       <w:r>
-        <w:t>Teaching Mode with</w:t>
-      </w:r>
-      <w:r>
-        <w:t>out</w:t>
-      </w:r>
-      <w:r>
-        <w:t xml:space="preserve"> Error Check</w:t>
+        <w:t>Teaching Mode without Error Check</w:t>
       </w:r>
     </w:p>
     <w:p>
@@ -17976,10 +19211,7 @@
       <w:bookmarkStart w:id="15" w:name="_Teaching_Mode_command"/>
       <w:bookmarkEnd w:id="15"/>
       <w:r>
-        <w:t xml:space="preserve">Teaching Mode </w:t>
-      </w:r>
-      <w:r>
-        <w:t>command sequence</w:t>
+        <w:t>Teaching Mode command sequence</w:t>
       </w:r>
     </w:p>
     <w:tbl>
@@ -18005,8 +19237,14 @@
           <w:p>
             <w:pPr>
               <w:jc w:val="center"/>
-            </w:pPr>
-            <w:r>
+              <w:rPr>
+                <w:rFonts w:ascii="Calibri Light" w:hAnsi="Calibri Light"/>
+              </w:rPr>
+            </w:pPr>
+            <w:r>
+              <w:rPr>
+                <w:rFonts w:ascii="Calibri Light" w:hAnsi="Calibri Light"/>
+              </w:rPr>
               <w:t>Command Number</w:t>
             </w:r>
           </w:p>
@@ -18019,8 +19257,14 @@
             <w:pPr>
               <w:jc w:val="center"/>
               <w:cnfStyle w:val="100000000000" w:firstRow="1" w:lastRow="0" w:firstColumn="0" w:lastColumn="0" w:oddVBand="0" w:evenVBand="0" w:oddHBand="0" w:evenHBand="0" w:firstRowFirstColumn="0" w:firstRowLastColumn="0" w:lastRowFirstColumn="0" w:lastRowLastColumn="0"/>
-            </w:pPr>
-            <w:r>
+              <w:rPr>
+                <w:rFonts w:ascii="Calibri Light" w:hAnsi="Calibri Light"/>
+              </w:rPr>
+            </w:pPr>
+            <w:r>
+              <w:rPr>
+                <w:rFonts w:ascii="Calibri Light" w:hAnsi="Calibri Light"/>
+              </w:rPr>
               <w:t>Power</w:t>
             </w:r>
           </w:p>
@@ -18033,8 +19277,14 @@
             <w:pPr>
               <w:jc w:val="center"/>
               <w:cnfStyle w:val="100000000000" w:firstRow="1" w:lastRow="0" w:firstColumn="0" w:lastColumn="0" w:oddVBand="0" w:evenVBand="0" w:oddHBand="0" w:evenHBand="0" w:firstRowFirstColumn="0" w:firstRowLastColumn="0" w:lastRowFirstColumn="0" w:lastRowLastColumn="0"/>
-            </w:pPr>
-            <w:r>
+              <w:rPr>
+                <w:rFonts w:ascii="Calibri Light" w:hAnsi="Calibri Light"/>
+              </w:rPr>
+            </w:pPr>
+            <w:r>
+              <w:rPr>
+                <w:rFonts w:ascii="Calibri Light" w:hAnsi="Calibri Light"/>
+              </w:rPr>
               <w:t>Temperature</w:t>
             </w:r>
           </w:p>
@@ -18049,8 +19299,14 @@
           <w:p>
             <w:pPr>
               <w:jc w:val="center"/>
-            </w:pPr>
-            <w:r>
+              <w:rPr>
+                <w:rFonts w:ascii="Calibri Light" w:hAnsi="Calibri Light"/>
+              </w:rPr>
+            </w:pPr>
+            <w:r>
+              <w:rPr>
+                <w:rFonts w:ascii="Calibri Light" w:hAnsi="Calibri Light"/>
+              </w:rPr>
               <w:t>1</w:t>
             </w:r>
           </w:p>
@@ -18063,8 +19319,14 @@
             <w:pPr>
               <w:jc w:val="center"/>
               <w:cnfStyle w:val="000000000000" w:firstRow="0" w:lastRow="0" w:firstColumn="0" w:lastColumn="0" w:oddVBand="0" w:evenVBand="0" w:oddHBand="0" w:evenHBand="0" w:firstRowFirstColumn="0" w:firstRowLastColumn="0" w:lastRowFirstColumn="0" w:lastRowLastColumn="0"/>
-            </w:pPr>
-            <w:r>
+              <w:rPr>
+                <w:rFonts w:ascii="Calibri Light" w:hAnsi="Calibri Light"/>
+              </w:rPr>
+            </w:pPr>
+            <w:r>
+              <w:rPr>
+                <w:rFonts w:ascii="Calibri Light" w:hAnsi="Calibri Light"/>
+              </w:rPr>
               <w:t>Off</w:t>
             </w:r>
           </w:p>
@@ -18077,8 +19339,14 @@
             <w:pPr>
               <w:jc w:val="center"/>
               <w:cnfStyle w:val="000000000000" w:firstRow="0" w:lastRow="0" w:firstColumn="0" w:lastColumn="0" w:oddVBand="0" w:evenVBand="0" w:oddHBand="0" w:evenHBand="0" w:firstRowFirstColumn="0" w:firstRowLastColumn="0" w:lastRowFirstColumn="0" w:lastRowLastColumn="0"/>
-            </w:pPr>
-            <w:r>
+              <w:rPr>
+                <w:rFonts w:ascii="Calibri Light" w:hAnsi="Calibri Light"/>
+              </w:rPr>
+            </w:pPr>
+            <w:r>
+              <w:rPr>
+                <w:rFonts w:ascii="Calibri Light" w:hAnsi="Calibri Light"/>
+              </w:rPr>
               <w:t>Anything</w:t>
             </w:r>
           </w:p>
@@ -18093,8 +19361,14 @@
           <w:p>
             <w:pPr>
               <w:jc w:val="center"/>
-            </w:pPr>
-            <w:r>
+              <w:rPr>
+                <w:rFonts w:ascii="Calibri Light" w:hAnsi="Calibri Light"/>
+              </w:rPr>
+            </w:pPr>
+            <w:r>
+              <w:rPr>
+                <w:rFonts w:ascii="Calibri Light" w:hAnsi="Calibri Light"/>
+              </w:rPr>
               <w:t>2</w:t>
             </w:r>
           </w:p>
@@ -18107,8 +19381,14 @@
             <w:pPr>
               <w:jc w:val="center"/>
               <w:cnfStyle w:val="000000000000" w:firstRow="0" w:lastRow="0" w:firstColumn="0" w:lastColumn="0" w:oddVBand="0" w:evenVBand="0" w:oddHBand="0" w:evenHBand="0" w:firstRowFirstColumn="0" w:firstRowLastColumn="0" w:lastRowFirstColumn="0" w:lastRowLastColumn="0"/>
-            </w:pPr>
-            <w:r>
+              <w:rPr>
+                <w:rFonts w:ascii="Calibri Light" w:hAnsi="Calibri Light"/>
+              </w:rPr>
+            </w:pPr>
+            <w:r>
+              <w:rPr>
+                <w:rFonts w:ascii="Calibri Light" w:hAnsi="Calibri Light"/>
+              </w:rPr>
               <w:t>On</w:t>
             </w:r>
           </w:p>
@@ -18121,8 +19401,14 @@
             <w:pPr>
               <w:jc w:val="center"/>
               <w:cnfStyle w:val="000000000000" w:firstRow="0" w:lastRow="0" w:firstColumn="0" w:lastColumn="0" w:oddVBand="0" w:evenVBand="0" w:oddHBand="0" w:evenHBand="0" w:firstRowFirstColumn="0" w:firstRowLastColumn="0" w:lastRowFirstColumn="0" w:lastRowLastColumn="0"/>
-            </w:pPr>
-            <w:r>
+              <w:rPr>
+                <w:rFonts w:ascii="Calibri Light" w:hAnsi="Calibri Light"/>
+              </w:rPr>
+            </w:pPr>
+            <w:r>
+              <w:rPr>
+                <w:rFonts w:ascii="Calibri Light" w:hAnsi="Calibri Light"/>
+              </w:rPr>
               <w:t>18</w:t>
             </w:r>
           </w:p>
@@ -18137,8 +19423,14 @@
           <w:p>
             <w:pPr>
               <w:jc w:val="center"/>
-            </w:pPr>
-            <w:r>
+              <w:rPr>
+                <w:rFonts w:ascii="Calibri Light" w:hAnsi="Calibri Light"/>
+              </w:rPr>
+            </w:pPr>
+            <w:r>
+              <w:rPr>
+                <w:rFonts w:ascii="Calibri Light" w:hAnsi="Calibri Light"/>
+              </w:rPr>
               <w:t>3</w:t>
             </w:r>
           </w:p>
@@ -18151,8 +19443,14 @@
             <w:pPr>
               <w:jc w:val="center"/>
               <w:cnfStyle w:val="000000000000" w:firstRow="0" w:lastRow="0" w:firstColumn="0" w:lastColumn="0" w:oddVBand="0" w:evenVBand="0" w:oddHBand="0" w:evenHBand="0" w:firstRowFirstColumn="0" w:firstRowLastColumn="0" w:lastRowFirstColumn="0" w:lastRowLastColumn="0"/>
-            </w:pPr>
-            <w:r>
+              <w:rPr>
+                <w:rFonts w:ascii="Calibri Light" w:hAnsi="Calibri Light"/>
+              </w:rPr>
+            </w:pPr>
+            <w:r>
+              <w:rPr>
+                <w:rFonts w:ascii="Calibri Light" w:hAnsi="Calibri Light"/>
+              </w:rPr>
               <w:t>On</w:t>
             </w:r>
           </w:p>
@@ -18165,8 +19463,14 @@
             <w:pPr>
               <w:jc w:val="center"/>
               <w:cnfStyle w:val="000000000000" w:firstRow="0" w:lastRow="0" w:firstColumn="0" w:lastColumn="0" w:oddVBand="0" w:evenVBand="0" w:oddHBand="0" w:evenHBand="0" w:firstRowFirstColumn="0" w:firstRowLastColumn="0" w:lastRowFirstColumn="0" w:lastRowLastColumn="0"/>
-            </w:pPr>
-            <w:r>
+              <w:rPr>
+                <w:rFonts w:ascii="Calibri Light" w:hAnsi="Calibri Light"/>
+              </w:rPr>
+            </w:pPr>
+            <w:r>
+              <w:rPr>
+                <w:rFonts w:ascii="Calibri Light" w:hAnsi="Calibri Light"/>
+              </w:rPr>
               <w:t>19</w:t>
             </w:r>
           </w:p>
@@ -18181,9 +19485,14 @@
           <w:p>
             <w:pPr>
               <w:jc w:val="center"/>
-            </w:pPr>
-            <w:r>
-              <w:lastRenderedPageBreak/>
+              <w:rPr>
+                <w:rFonts w:ascii="Calibri Light" w:hAnsi="Calibri Light"/>
+              </w:rPr>
+            </w:pPr>
+            <w:r>
+              <w:rPr>
+                <w:rFonts w:ascii="Calibri Light" w:hAnsi="Calibri Light"/>
+              </w:rPr>
               <w:t>4</w:t>
             </w:r>
           </w:p>
@@ -18196,8 +19505,14 @@
             <w:pPr>
               <w:jc w:val="center"/>
               <w:cnfStyle w:val="000000000000" w:firstRow="0" w:lastRow="0" w:firstColumn="0" w:lastColumn="0" w:oddVBand="0" w:evenVBand="0" w:oddHBand="0" w:evenHBand="0" w:firstRowFirstColumn="0" w:firstRowLastColumn="0" w:lastRowFirstColumn="0" w:lastRowLastColumn="0"/>
-            </w:pPr>
-            <w:r>
+              <w:rPr>
+                <w:rFonts w:ascii="Calibri Light" w:hAnsi="Calibri Light"/>
+              </w:rPr>
+            </w:pPr>
+            <w:r>
+              <w:rPr>
+                <w:rFonts w:ascii="Calibri Light" w:hAnsi="Calibri Light"/>
+              </w:rPr>
               <w:t>On</w:t>
             </w:r>
           </w:p>
@@ -18210,8 +19525,14 @@
             <w:pPr>
               <w:jc w:val="center"/>
               <w:cnfStyle w:val="000000000000" w:firstRow="0" w:lastRow="0" w:firstColumn="0" w:lastColumn="0" w:oddVBand="0" w:evenVBand="0" w:oddHBand="0" w:evenHBand="0" w:firstRowFirstColumn="0" w:firstRowLastColumn="0" w:lastRowFirstColumn="0" w:lastRowLastColumn="0"/>
-            </w:pPr>
-            <w:r>
+              <w:rPr>
+                <w:rFonts w:ascii="Calibri Light" w:hAnsi="Calibri Light"/>
+              </w:rPr>
+            </w:pPr>
+            <w:r>
+              <w:rPr>
+                <w:rFonts w:ascii="Calibri Light" w:hAnsi="Calibri Light"/>
+              </w:rPr>
               <w:t>20</w:t>
             </w:r>
           </w:p>
@@ -18226,8 +19547,14 @@
           <w:p>
             <w:pPr>
               <w:jc w:val="center"/>
-            </w:pPr>
-            <w:r>
+              <w:rPr>
+                <w:rFonts w:ascii="Calibri Light" w:hAnsi="Calibri Light"/>
+              </w:rPr>
+            </w:pPr>
+            <w:r>
+              <w:rPr>
+                <w:rFonts w:ascii="Calibri Light" w:hAnsi="Calibri Light"/>
+              </w:rPr>
               <w:t>5</w:t>
             </w:r>
           </w:p>
@@ -18240,8 +19567,14 @@
             <w:pPr>
               <w:jc w:val="center"/>
               <w:cnfStyle w:val="000000000000" w:firstRow="0" w:lastRow="0" w:firstColumn="0" w:lastColumn="0" w:oddVBand="0" w:evenVBand="0" w:oddHBand="0" w:evenHBand="0" w:firstRowFirstColumn="0" w:firstRowLastColumn="0" w:lastRowFirstColumn="0" w:lastRowLastColumn="0"/>
-            </w:pPr>
-            <w:r>
+              <w:rPr>
+                <w:rFonts w:ascii="Calibri Light" w:hAnsi="Calibri Light"/>
+              </w:rPr>
+            </w:pPr>
+            <w:r>
+              <w:rPr>
+                <w:rFonts w:ascii="Calibri Light" w:hAnsi="Calibri Light"/>
+              </w:rPr>
               <w:t>On</w:t>
             </w:r>
           </w:p>
@@ -18254,8 +19587,14 @@
             <w:pPr>
               <w:jc w:val="center"/>
               <w:cnfStyle w:val="000000000000" w:firstRow="0" w:lastRow="0" w:firstColumn="0" w:lastColumn="0" w:oddVBand="0" w:evenVBand="0" w:oddHBand="0" w:evenHBand="0" w:firstRowFirstColumn="0" w:firstRowLastColumn="0" w:lastRowFirstColumn="0" w:lastRowLastColumn="0"/>
-            </w:pPr>
-            <w:r>
+              <w:rPr>
+                <w:rFonts w:ascii="Calibri Light" w:hAnsi="Calibri Light"/>
+              </w:rPr>
+            </w:pPr>
+            <w:r>
+              <w:rPr>
+                <w:rFonts w:ascii="Calibri Light" w:hAnsi="Calibri Light"/>
+              </w:rPr>
               <w:t>21</w:t>
             </w:r>
           </w:p>
@@ -18270,8 +19609,14 @@
           <w:p>
             <w:pPr>
               <w:jc w:val="center"/>
-            </w:pPr>
-            <w:r>
+              <w:rPr>
+                <w:rFonts w:ascii="Calibri Light" w:hAnsi="Calibri Light"/>
+              </w:rPr>
+            </w:pPr>
+            <w:r>
+              <w:rPr>
+                <w:rFonts w:ascii="Calibri Light" w:hAnsi="Calibri Light"/>
+              </w:rPr>
               <w:t>6</w:t>
             </w:r>
           </w:p>
@@ -18284,8 +19629,14 @@
             <w:pPr>
               <w:jc w:val="center"/>
               <w:cnfStyle w:val="000000000000" w:firstRow="0" w:lastRow="0" w:firstColumn="0" w:lastColumn="0" w:oddVBand="0" w:evenVBand="0" w:oddHBand="0" w:evenHBand="0" w:firstRowFirstColumn="0" w:firstRowLastColumn="0" w:lastRowFirstColumn="0" w:lastRowLastColumn="0"/>
-            </w:pPr>
-            <w:r>
+              <w:rPr>
+                <w:rFonts w:ascii="Calibri Light" w:hAnsi="Calibri Light"/>
+              </w:rPr>
+            </w:pPr>
+            <w:r>
+              <w:rPr>
+                <w:rFonts w:ascii="Calibri Light" w:hAnsi="Calibri Light"/>
+              </w:rPr>
               <w:t>On</w:t>
             </w:r>
           </w:p>
@@ -18298,8 +19649,14 @@
             <w:pPr>
               <w:jc w:val="center"/>
               <w:cnfStyle w:val="000000000000" w:firstRow="0" w:lastRow="0" w:firstColumn="0" w:lastColumn="0" w:oddVBand="0" w:evenVBand="0" w:oddHBand="0" w:evenHBand="0" w:firstRowFirstColumn="0" w:firstRowLastColumn="0" w:lastRowFirstColumn="0" w:lastRowLastColumn="0"/>
-            </w:pPr>
-            <w:r>
+              <w:rPr>
+                <w:rFonts w:ascii="Calibri Light" w:hAnsi="Calibri Light"/>
+              </w:rPr>
+            </w:pPr>
+            <w:r>
+              <w:rPr>
+                <w:rFonts w:ascii="Calibri Light" w:hAnsi="Calibri Light"/>
+              </w:rPr>
               <w:t>22</w:t>
             </w:r>
           </w:p>
@@ -18314,8 +19671,14 @@
           <w:p>
             <w:pPr>
               <w:jc w:val="center"/>
-            </w:pPr>
-            <w:r>
+              <w:rPr>
+                <w:rFonts w:ascii="Calibri Light" w:hAnsi="Calibri Light"/>
+              </w:rPr>
+            </w:pPr>
+            <w:r>
+              <w:rPr>
+                <w:rFonts w:ascii="Calibri Light" w:hAnsi="Calibri Light"/>
+              </w:rPr>
               <w:t>7</w:t>
             </w:r>
           </w:p>
@@ -18328,8 +19691,14 @@
             <w:pPr>
               <w:jc w:val="center"/>
               <w:cnfStyle w:val="000000000000" w:firstRow="0" w:lastRow="0" w:firstColumn="0" w:lastColumn="0" w:oddVBand="0" w:evenVBand="0" w:oddHBand="0" w:evenHBand="0" w:firstRowFirstColumn="0" w:firstRowLastColumn="0" w:lastRowFirstColumn="0" w:lastRowLastColumn="0"/>
-            </w:pPr>
-            <w:r>
+              <w:rPr>
+                <w:rFonts w:ascii="Calibri Light" w:hAnsi="Calibri Light"/>
+              </w:rPr>
+            </w:pPr>
+            <w:r>
+              <w:rPr>
+                <w:rFonts w:ascii="Calibri Light" w:hAnsi="Calibri Light"/>
+              </w:rPr>
               <w:t>On</w:t>
             </w:r>
           </w:p>
@@ -18342,8 +19711,14 @@
             <w:pPr>
               <w:jc w:val="center"/>
               <w:cnfStyle w:val="000000000000" w:firstRow="0" w:lastRow="0" w:firstColumn="0" w:lastColumn="0" w:oddVBand="0" w:evenVBand="0" w:oddHBand="0" w:evenHBand="0" w:firstRowFirstColumn="0" w:firstRowLastColumn="0" w:lastRowFirstColumn="0" w:lastRowLastColumn="0"/>
-            </w:pPr>
-            <w:r>
+              <w:rPr>
+                <w:rFonts w:ascii="Calibri Light" w:hAnsi="Calibri Light"/>
+              </w:rPr>
+            </w:pPr>
+            <w:r>
+              <w:rPr>
+                <w:rFonts w:ascii="Calibri Light" w:hAnsi="Calibri Light"/>
+              </w:rPr>
               <w:t>23</w:t>
             </w:r>
           </w:p>
@@ -18358,8 +19733,14 @@
           <w:p>
             <w:pPr>
               <w:jc w:val="center"/>
-            </w:pPr>
-            <w:r>
+              <w:rPr>
+                <w:rFonts w:ascii="Calibri Light" w:hAnsi="Calibri Light"/>
+              </w:rPr>
+            </w:pPr>
+            <w:r>
+              <w:rPr>
+                <w:rFonts w:ascii="Calibri Light" w:hAnsi="Calibri Light"/>
+              </w:rPr>
               <w:t>8</w:t>
             </w:r>
           </w:p>
@@ -18372,8 +19753,14 @@
             <w:pPr>
               <w:jc w:val="center"/>
               <w:cnfStyle w:val="000000000000" w:firstRow="0" w:lastRow="0" w:firstColumn="0" w:lastColumn="0" w:oddVBand="0" w:evenVBand="0" w:oddHBand="0" w:evenHBand="0" w:firstRowFirstColumn="0" w:firstRowLastColumn="0" w:lastRowFirstColumn="0" w:lastRowLastColumn="0"/>
-            </w:pPr>
-            <w:r>
+              <w:rPr>
+                <w:rFonts w:ascii="Calibri Light" w:hAnsi="Calibri Light"/>
+              </w:rPr>
+            </w:pPr>
+            <w:r>
+              <w:rPr>
+                <w:rFonts w:ascii="Calibri Light" w:hAnsi="Calibri Light"/>
+              </w:rPr>
               <w:t>On</w:t>
             </w:r>
           </w:p>
@@ -18386,8 +19773,14 @@
             <w:pPr>
               <w:jc w:val="center"/>
               <w:cnfStyle w:val="000000000000" w:firstRow="0" w:lastRow="0" w:firstColumn="0" w:lastColumn="0" w:oddVBand="0" w:evenVBand="0" w:oddHBand="0" w:evenHBand="0" w:firstRowFirstColumn="0" w:firstRowLastColumn="0" w:lastRowFirstColumn="0" w:lastRowLastColumn="0"/>
-            </w:pPr>
-            <w:r>
+              <w:rPr>
+                <w:rFonts w:ascii="Calibri Light" w:hAnsi="Calibri Light"/>
+              </w:rPr>
+            </w:pPr>
+            <w:r>
+              <w:rPr>
+                <w:rFonts w:ascii="Calibri Light" w:hAnsi="Calibri Light"/>
+              </w:rPr>
               <w:t>24</w:t>
             </w:r>
           </w:p>
@@ -18402,8 +19795,14 @@
           <w:p>
             <w:pPr>
               <w:jc w:val="center"/>
-            </w:pPr>
-            <w:r>
+              <w:rPr>
+                <w:rFonts w:ascii="Calibri Light" w:hAnsi="Calibri Light"/>
+              </w:rPr>
+            </w:pPr>
+            <w:r>
+              <w:rPr>
+                <w:rFonts w:ascii="Calibri Light" w:hAnsi="Calibri Light"/>
+              </w:rPr>
               <w:t>9</w:t>
             </w:r>
           </w:p>
@@ -18416,8 +19815,14 @@
             <w:pPr>
               <w:jc w:val="center"/>
               <w:cnfStyle w:val="000000000000" w:firstRow="0" w:lastRow="0" w:firstColumn="0" w:lastColumn="0" w:oddVBand="0" w:evenVBand="0" w:oddHBand="0" w:evenHBand="0" w:firstRowFirstColumn="0" w:firstRowLastColumn="0" w:lastRowFirstColumn="0" w:lastRowLastColumn="0"/>
-            </w:pPr>
-            <w:r>
+              <w:rPr>
+                <w:rFonts w:ascii="Calibri Light" w:hAnsi="Calibri Light"/>
+              </w:rPr>
+            </w:pPr>
+            <w:r>
+              <w:rPr>
+                <w:rFonts w:ascii="Calibri Light" w:hAnsi="Calibri Light"/>
+              </w:rPr>
               <w:t>On</w:t>
             </w:r>
           </w:p>
@@ -18430,8 +19835,14 @@
             <w:pPr>
               <w:jc w:val="center"/>
               <w:cnfStyle w:val="000000000000" w:firstRow="0" w:lastRow="0" w:firstColumn="0" w:lastColumn="0" w:oddVBand="0" w:evenVBand="0" w:oddHBand="0" w:evenHBand="0" w:firstRowFirstColumn="0" w:firstRowLastColumn="0" w:lastRowFirstColumn="0" w:lastRowLastColumn="0"/>
-            </w:pPr>
-            <w:r>
+              <w:rPr>
+                <w:rFonts w:ascii="Calibri Light" w:hAnsi="Calibri Light"/>
+              </w:rPr>
+            </w:pPr>
+            <w:r>
+              <w:rPr>
+                <w:rFonts w:ascii="Calibri Light" w:hAnsi="Calibri Light"/>
+              </w:rPr>
               <w:t>25</w:t>
             </w:r>
           </w:p>
@@ -18446,8 +19857,14 @@
           <w:p>
             <w:pPr>
               <w:jc w:val="center"/>
-            </w:pPr>
-            <w:r>
+              <w:rPr>
+                <w:rFonts w:ascii="Calibri Light" w:hAnsi="Calibri Light"/>
+              </w:rPr>
+            </w:pPr>
+            <w:r>
+              <w:rPr>
+                <w:rFonts w:ascii="Calibri Light" w:hAnsi="Calibri Light"/>
+              </w:rPr>
               <w:t>10</w:t>
             </w:r>
           </w:p>
@@ -18460,8 +19877,14 @@
             <w:pPr>
               <w:jc w:val="center"/>
               <w:cnfStyle w:val="000000000000" w:firstRow="0" w:lastRow="0" w:firstColumn="0" w:lastColumn="0" w:oddVBand="0" w:evenVBand="0" w:oddHBand="0" w:evenHBand="0" w:firstRowFirstColumn="0" w:firstRowLastColumn="0" w:lastRowFirstColumn="0" w:lastRowLastColumn="0"/>
-            </w:pPr>
-            <w:r>
+              <w:rPr>
+                <w:rFonts w:ascii="Calibri Light" w:hAnsi="Calibri Light"/>
+              </w:rPr>
+            </w:pPr>
+            <w:r>
+              <w:rPr>
+                <w:rFonts w:ascii="Calibri Light" w:hAnsi="Calibri Light"/>
+              </w:rPr>
               <w:t>On</w:t>
             </w:r>
           </w:p>
@@ -18474,8 +19897,14 @@
             <w:pPr>
               <w:jc w:val="center"/>
               <w:cnfStyle w:val="000000000000" w:firstRow="0" w:lastRow="0" w:firstColumn="0" w:lastColumn="0" w:oddVBand="0" w:evenVBand="0" w:oddHBand="0" w:evenHBand="0" w:firstRowFirstColumn="0" w:firstRowLastColumn="0" w:lastRowFirstColumn="0" w:lastRowLastColumn="0"/>
-            </w:pPr>
-            <w:r>
+              <w:rPr>
+                <w:rFonts w:ascii="Calibri Light" w:hAnsi="Calibri Light"/>
+              </w:rPr>
+            </w:pPr>
+            <w:r>
+              <w:rPr>
+                <w:rFonts w:ascii="Calibri Light" w:hAnsi="Calibri Light"/>
+              </w:rPr>
               <w:t>26</w:t>
             </w:r>
           </w:p>
@@ -18490,8 +19919,14 @@
           <w:p>
             <w:pPr>
               <w:jc w:val="center"/>
-            </w:pPr>
-            <w:r>
+              <w:rPr>
+                <w:rFonts w:ascii="Calibri Light" w:hAnsi="Calibri Light"/>
+              </w:rPr>
+            </w:pPr>
+            <w:r>
+              <w:rPr>
+                <w:rFonts w:ascii="Calibri Light" w:hAnsi="Calibri Light"/>
+              </w:rPr>
               <w:t>11</w:t>
             </w:r>
           </w:p>
@@ -18504,8 +19939,14 @@
             <w:pPr>
               <w:jc w:val="center"/>
               <w:cnfStyle w:val="000000000000" w:firstRow="0" w:lastRow="0" w:firstColumn="0" w:lastColumn="0" w:oddVBand="0" w:evenVBand="0" w:oddHBand="0" w:evenHBand="0" w:firstRowFirstColumn="0" w:firstRowLastColumn="0" w:lastRowFirstColumn="0" w:lastRowLastColumn="0"/>
-            </w:pPr>
-            <w:r>
+              <w:rPr>
+                <w:rFonts w:ascii="Calibri Light" w:hAnsi="Calibri Light"/>
+              </w:rPr>
+            </w:pPr>
+            <w:r>
+              <w:rPr>
+                <w:rFonts w:ascii="Calibri Light" w:hAnsi="Calibri Light"/>
+              </w:rPr>
               <w:t>On</w:t>
             </w:r>
           </w:p>
@@ -18518,8 +19959,14 @@
             <w:pPr>
               <w:jc w:val="center"/>
               <w:cnfStyle w:val="000000000000" w:firstRow="0" w:lastRow="0" w:firstColumn="0" w:lastColumn="0" w:oddVBand="0" w:evenVBand="0" w:oddHBand="0" w:evenHBand="0" w:firstRowFirstColumn="0" w:firstRowLastColumn="0" w:lastRowFirstColumn="0" w:lastRowLastColumn="0"/>
-            </w:pPr>
-            <w:r>
+              <w:rPr>
+                <w:rFonts w:ascii="Calibri Light" w:hAnsi="Calibri Light"/>
+              </w:rPr>
+            </w:pPr>
+            <w:r>
+              <w:rPr>
+                <w:rFonts w:ascii="Calibri Light" w:hAnsi="Calibri Light"/>
+              </w:rPr>
               <w:t>27</w:t>
             </w:r>
           </w:p>
@@ -18534,8 +19981,14 @@
           <w:p>
             <w:pPr>
               <w:jc w:val="center"/>
-            </w:pPr>
-            <w:r>
+              <w:rPr>
+                <w:rFonts w:ascii="Calibri Light" w:hAnsi="Calibri Light"/>
+              </w:rPr>
+            </w:pPr>
+            <w:r>
+              <w:rPr>
+                <w:rFonts w:ascii="Calibri Light" w:hAnsi="Calibri Light"/>
+              </w:rPr>
               <w:t>12</w:t>
             </w:r>
           </w:p>
@@ -18548,8 +20001,14 @@
             <w:pPr>
               <w:jc w:val="center"/>
               <w:cnfStyle w:val="000000000000" w:firstRow="0" w:lastRow="0" w:firstColumn="0" w:lastColumn="0" w:oddVBand="0" w:evenVBand="0" w:oddHBand="0" w:evenHBand="0" w:firstRowFirstColumn="0" w:firstRowLastColumn="0" w:lastRowFirstColumn="0" w:lastRowLastColumn="0"/>
-            </w:pPr>
-            <w:r>
+              <w:rPr>
+                <w:rFonts w:ascii="Calibri Light" w:hAnsi="Calibri Light"/>
+              </w:rPr>
+            </w:pPr>
+            <w:r>
+              <w:rPr>
+                <w:rFonts w:ascii="Calibri Light" w:hAnsi="Calibri Light"/>
+              </w:rPr>
               <w:t>On</w:t>
             </w:r>
           </w:p>
@@ -18562,8 +20021,14 @@
             <w:pPr>
               <w:jc w:val="center"/>
               <w:cnfStyle w:val="000000000000" w:firstRow="0" w:lastRow="0" w:firstColumn="0" w:lastColumn="0" w:oddVBand="0" w:evenVBand="0" w:oddHBand="0" w:evenHBand="0" w:firstRowFirstColumn="0" w:firstRowLastColumn="0" w:lastRowFirstColumn="0" w:lastRowLastColumn="0"/>
-            </w:pPr>
-            <w:r>
+              <w:rPr>
+                <w:rFonts w:ascii="Calibri Light" w:hAnsi="Calibri Light"/>
+              </w:rPr>
+            </w:pPr>
+            <w:r>
+              <w:rPr>
+                <w:rFonts w:ascii="Calibri Light" w:hAnsi="Calibri Light"/>
+              </w:rPr>
               <w:t>28</w:t>
             </w:r>
           </w:p>
@@ -18578,8 +20043,14 @@
           <w:p>
             <w:pPr>
               <w:jc w:val="center"/>
-            </w:pPr>
-            <w:r>
+              <w:rPr>
+                <w:rFonts w:ascii="Calibri Light" w:hAnsi="Calibri Light"/>
+              </w:rPr>
+            </w:pPr>
+            <w:r>
+              <w:rPr>
+                <w:rFonts w:ascii="Calibri Light" w:hAnsi="Calibri Light"/>
+              </w:rPr>
               <w:t>13</w:t>
             </w:r>
           </w:p>
@@ -18592,8 +20063,14 @@
             <w:pPr>
               <w:jc w:val="center"/>
               <w:cnfStyle w:val="000000000000" w:firstRow="0" w:lastRow="0" w:firstColumn="0" w:lastColumn="0" w:oddVBand="0" w:evenVBand="0" w:oddHBand="0" w:evenHBand="0" w:firstRowFirstColumn="0" w:firstRowLastColumn="0" w:lastRowFirstColumn="0" w:lastRowLastColumn="0"/>
-            </w:pPr>
-            <w:r>
+              <w:rPr>
+                <w:rFonts w:ascii="Calibri Light" w:hAnsi="Calibri Light"/>
+              </w:rPr>
+            </w:pPr>
+            <w:r>
+              <w:rPr>
+                <w:rFonts w:ascii="Calibri Light" w:hAnsi="Calibri Light"/>
+              </w:rPr>
               <w:t>On</w:t>
             </w:r>
           </w:p>
@@ -18606,8 +20083,14 @@
             <w:pPr>
               <w:jc w:val="center"/>
               <w:cnfStyle w:val="000000000000" w:firstRow="0" w:lastRow="0" w:firstColumn="0" w:lastColumn="0" w:oddVBand="0" w:evenVBand="0" w:oddHBand="0" w:evenHBand="0" w:firstRowFirstColumn="0" w:firstRowLastColumn="0" w:lastRowFirstColumn="0" w:lastRowLastColumn="0"/>
-            </w:pPr>
-            <w:r>
+              <w:rPr>
+                <w:rFonts w:ascii="Calibri Light" w:hAnsi="Calibri Light"/>
+              </w:rPr>
+            </w:pPr>
+            <w:r>
+              <w:rPr>
+                <w:rFonts w:ascii="Calibri Light" w:hAnsi="Calibri Light"/>
+              </w:rPr>
               <w:t>29</w:t>
             </w:r>
           </w:p>
@@ -18622,8 +20105,14 @@
           <w:p>
             <w:pPr>
               <w:jc w:val="center"/>
-            </w:pPr>
-            <w:r>
+              <w:rPr>
+                <w:rFonts w:ascii="Calibri Light" w:hAnsi="Calibri Light"/>
+              </w:rPr>
+            </w:pPr>
+            <w:r>
+              <w:rPr>
+                <w:rFonts w:ascii="Calibri Light" w:hAnsi="Calibri Light"/>
+              </w:rPr>
               <w:t>14</w:t>
             </w:r>
           </w:p>
@@ -18636,8 +20125,14 @@
             <w:pPr>
               <w:jc w:val="center"/>
               <w:cnfStyle w:val="000000000000" w:firstRow="0" w:lastRow="0" w:firstColumn="0" w:lastColumn="0" w:oddVBand="0" w:evenVBand="0" w:oddHBand="0" w:evenHBand="0" w:firstRowFirstColumn="0" w:firstRowLastColumn="0" w:lastRowFirstColumn="0" w:lastRowLastColumn="0"/>
-            </w:pPr>
-            <w:r>
+              <w:rPr>
+                <w:rFonts w:ascii="Calibri Light" w:hAnsi="Calibri Light"/>
+              </w:rPr>
+            </w:pPr>
+            <w:r>
+              <w:rPr>
+                <w:rFonts w:ascii="Calibri Light" w:hAnsi="Calibri Light"/>
+              </w:rPr>
               <w:t>On</w:t>
             </w:r>
           </w:p>
@@ -18650,8 +20145,14 @@
             <w:pPr>
               <w:jc w:val="center"/>
               <w:cnfStyle w:val="000000000000" w:firstRow="0" w:lastRow="0" w:firstColumn="0" w:lastColumn="0" w:oddVBand="0" w:evenVBand="0" w:oddHBand="0" w:evenHBand="0" w:firstRowFirstColumn="0" w:firstRowLastColumn="0" w:lastRowFirstColumn="0" w:lastRowLastColumn="0"/>
-            </w:pPr>
-            <w:r>
+              <w:rPr>
+                <w:rFonts w:ascii="Calibri Light" w:hAnsi="Calibri Light"/>
+              </w:rPr>
+            </w:pPr>
+            <w:r>
+              <w:rPr>
+                <w:rFonts w:ascii="Calibri Light" w:hAnsi="Calibri Light"/>
+              </w:rPr>
               <w:t>30</w:t>
             </w:r>
           </w:p>
@@ -18666,8 +20167,14 @@
           <w:p>
             <w:pPr>
               <w:jc w:val="center"/>
-            </w:pPr>
-            <w:r>
+              <w:rPr>
+                <w:rFonts w:ascii="Calibri Light" w:hAnsi="Calibri Light"/>
+              </w:rPr>
+            </w:pPr>
+            <w:r>
+              <w:rPr>
+                <w:rFonts w:ascii="Calibri Light" w:hAnsi="Calibri Light"/>
+              </w:rPr>
               <w:t>15</w:t>
             </w:r>
           </w:p>
@@ -18680,8 +20187,14 @@
             <w:pPr>
               <w:jc w:val="center"/>
               <w:cnfStyle w:val="000000000000" w:firstRow="0" w:lastRow="0" w:firstColumn="0" w:lastColumn="0" w:oddVBand="0" w:evenVBand="0" w:oddHBand="0" w:evenHBand="0" w:firstRowFirstColumn="0" w:firstRowLastColumn="0" w:lastRowFirstColumn="0" w:lastRowLastColumn="0"/>
-            </w:pPr>
-            <w:r>
+              <w:rPr>
+                <w:rFonts w:ascii="Calibri Light" w:hAnsi="Calibri Light"/>
+              </w:rPr>
+            </w:pPr>
+            <w:r>
+              <w:rPr>
+                <w:rFonts w:ascii="Calibri Light" w:hAnsi="Calibri Light"/>
+              </w:rPr>
               <w:t>On</w:t>
             </w:r>
           </w:p>
@@ -18694,8 +20207,14 @@
             <w:pPr>
               <w:jc w:val="center"/>
               <w:cnfStyle w:val="000000000000" w:firstRow="0" w:lastRow="0" w:firstColumn="0" w:lastColumn="0" w:oddVBand="0" w:evenVBand="0" w:oddHBand="0" w:evenHBand="0" w:firstRowFirstColumn="0" w:firstRowLastColumn="0" w:lastRowFirstColumn="0" w:lastRowLastColumn="0"/>
-            </w:pPr>
-            <w:r>
+              <w:rPr>
+                <w:rFonts w:ascii="Calibri Light" w:hAnsi="Calibri Light"/>
+              </w:rPr>
+            </w:pPr>
+            <w:r>
+              <w:rPr>
+                <w:rFonts w:ascii="Calibri Light" w:hAnsi="Calibri Light"/>
+              </w:rPr>
               <w:t>31</w:t>
             </w:r>
           </w:p>
@@ -18710,8 +20229,14 @@
           <w:p>
             <w:pPr>
               <w:jc w:val="center"/>
-            </w:pPr>
-            <w:r>
+              <w:rPr>
+                <w:rFonts w:ascii="Calibri Light" w:hAnsi="Calibri Light"/>
+              </w:rPr>
+            </w:pPr>
+            <w:r>
+              <w:rPr>
+                <w:rFonts w:ascii="Calibri Light" w:hAnsi="Calibri Light"/>
+              </w:rPr>
               <w:t>16</w:t>
             </w:r>
           </w:p>
@@ -18724,8 +20249,14 @@
             <w:pPr>
               <w:jc w:val="center"/>
               <w:cnfStyle w:val="000000000000" w:firstRow="0" w:lastRow="0" w:firstColumn="0" w:lastColumn="0" w:oddVBand="0" w:evenVBand="0" w:oddHBand="0" w:evenHBand="0" w:firstRowFirstColumn="0" w:firstRowLastColumn="0" w:lastRowFirstColumn="0" w:lastRowLastColumn="0"/>
-            </w:pPr>
-            <w:r>
+              <w:rPr>
+                <w:rFonts w:ascii="Calibri Light" w:hAnsi="Calibri Light"/>
+              </w:rPr>
+            </w:pPr>
+            <w:r>
+              <w:rPr>
+                <w:rFonts w:ascii="Calibri Light" w:hAnsi="Calibri Light"/>
+              </w:rPr>
               <w:t>On</w:t>
             </w:r>
           </w:p>
@@ -18738,8 +20269,14 @@
             <w:pPr>
               <w:jc w:val="center"/>
               <w:cnfStyle w:val="000000000000" w:firstRow="0" w:lastRow="0" w:firstColumn="0" w:lastColumn="0" w:oddVBand="0" w:evenVBand="0" w:oddHBand="0" w:evenHBand="0" w:firstRowFirstColumn="0" w:firstRowLastColumn="0" w:lastRowFirstColumn="0" w:lastRowLastColumn="0"/>
-            </w:pPr>
-            <w:r>
+              <w:rPr>
+                <w:rFonts w:ascii="Calibri Light" w:hAnsi="Calibri Light"/>
+              </w:rPr>
+            </w:pPr>
+            <w:r>
+              <w:rPr>
+                <w:rFonts w:ascii="Calibri Light" w:hAnsi="Calibri Light"/>
+              </w:rPr>
               <w:t>32</w:t>
             </w:r>
           </w:p>
@@ -18751,6 +20288,7 @@
         <w:pStyle w:val="Heading1"/>
       </w:pPr>
       <w:r>
+        <w:lastRenderedPageBreak/>
         <w:t xml:space="preserve">Setup Instructions </w:t>
       </w:r>
     </w:p>
@@ -19030,11 +20568,7 @@
         <w:ind w:left="709"/>
       </w:pPr>
       <w:r>
-        <w:lastRenderedPageBreak/>
-        <w:t xml:space="preserve">If the Gateway is solid Green, </w:t>
-      </w:r>
-      <w:r>
-        <w:t>Gateway is now ready to control the AC.</w:t>
+        <w:t>If the Gateway is solid Green, Gateway is now ready to control the AC.</w:t>
       </w:r>
     </w:p>
     <w:sectPr>
@@ -19051,7 +20585,7 @@
 </file>
 
 <file path=word/endnotes.xml><?xml version="1.0" encoding="utf-8"?>
-<w:endnotes xmlns:wpc="http://schemas.microsoft.com/office/word/2010/wordprocessingCanvas" xmlns:cx="http://schemas.microsoft.com/office/drawing/2014/chartex" xmlns:cx1="http://schemas.microsoft.com/office/drawing/2015/9/8/chartex" xmlns:cx2="http://schemas.microsoft.com/office/drawing/2015/10/21/chartex" xmlns:cx3="http://schemas.microsoft.com/office/drawing/2016/5/9/chartex" xmlns:cx4="http://schemas.microsoft.com/office/drawing/2016/5/10/chartex" xmlns:cx5="http://schemas.microsoft.com/office/drawing/2016/5/11/chartex" xmlns:cx6="http://schemas.microsoft.com/office/drawing/2016/5/12/chartex" xmlns:cx7="http://schemas.microsoft.com/office/drawing/2016/5/13/chartex" xmlns:cx8="http://schemas.microsoft.com/office/drawing/2016/5/14/chartex" xmlns:mc="http://schemas.openxmlformats.org/markup-compatibility/2006" xmlns:aink="http://schemas.microsoft.com/office/drawing/2016/ink" xmlns:am3d="http://schemas.microsoft.com/office/drawing/2017/model3d" xmlns:o="urn:schemas-microsoft-com:office:office" xmlns:oel="http://schemas.microsoft.com/office/2019/extlst" xmlns:r="http://schemas.openxmlformats.org/officeDocument/2006/relationships" xmlns:m="http://schemas.openxmlformats.org/officeDocument/2006/math" xmlns:v="urn:schemas-microsoft-com:vml" xmlns:wp14="http://schemas.microsoft.com/office/word/2010/wordprocessingDrawing" xmlns:wp="http://schemas.openxmlformats.org/drawingml/2006/wordprocessingDrawing" xmlns:w10="urn:schemas-microsoft-com:office:word" xmlns:w="http://schemas.openxmlformats.org/wordprocessingml/2006/main" xmlns:w14="http://schemas.microsoft.com/office/word/2010/wordml" xmlns:w15="http://schemas.microsoft.com/office/word/2012/wordml" xmlns:w16cex="http://schemas.microsoft.com/office/word/2018/wordml/cex" xmlns:w16cid="http://schemas.microsoft.com/office/word/2016/wordml/cid" xmlns:w16="http://schemas.microsoft.com/office/word/2018/wordml" xmlns:w16du="http://schemas.microsoft.com/office/word/2023/wordml/word16du" xmlns:w16sdtdh="http://schemas.microsoft.com/office/word/2020/wordml/sdtdatahash" xmlns:w16se="http://schemas.microsoft.com/office/word/2015/wordml/symex" xmlns:wpg="http://schemas.microsoft.com/office/word/2010/wordprocessingGroup" xmlns:wpi="http://schemas.microsoft.com/office/word/2010/wordprocessingInk" xmlns:wne="http://schemas.microsoft.com/office/word/2006/wordml" xmlns:wps="http://schemas.microsoft.com/office/word/2010/wordprocessingShape" mc:Ignorable="w14 w15 w16se w16cid w16 w16cex w16sdtdh w16du wp14">
+<w:endnotes xmlns:wpc="http://schemas.microsoft.com/office/word/2010/wordprocessingCanvas" xmlns:cx="http://schemas.microsoft.com/office/drawing/2014/chartex" xmlns:cx1="http://schemas.microsoft.com/office/drawing/2015/9/8/chartex" xmlns:cx2="http://schemas.microsoft.com/office/drawing/2015/10/21/chartex" xmlns:cx3="http://schemas.microsoft.com/office/drawing/2016/5/9/chartex" xmlns:cx4="http://schemas.microsoft.com/office/drawing/2016/5/10/chartex" xmlns:cx5="http://schemas.microsoft.com/office/drawing/2016/5/11/chartex" xmlns:cx6="http://schemas.microsoft.com/office/drawing/2016/5/12/chartex" xmlns:cx7="http://schemas.microsoft.com/office/drawing/2016/5/13/chartex" xmlns:cx8="http://schemas.microsoft.com/office/drawing/2016/5/14/chartex" xmlns:mc="http://schemas.openxmlformats.org/markup-compatibility/2006" xmlns:aink="http://schemas.microsoft.com/office/drawing/2016/ink" xmlns:am3d="http://schemas.microsoft.com/office/drawing/2017/model3d" xmlns:o="urn:schemas-microsoft-com:office:office" xmlns:oel="http://schemas.microsoft.com/office/2019/extlst" xmlns:r="http://schemas.openxmlformats.org/officeDocument/2006/relationships" xmlns:m="http://schemas.openxmlformats.org/officeDocument/2006/math" xmlns:v="urn:schemas-microsoft-com:vml" xmlns:wp14="http://schemas.microsoft.com/office/word/2010/wordprocessingDrawing" xmlns:wp="http://schemas.openxmlformats.org/drawingml/2006/wordprocessingDrawing" xmlns:w10="urn:schemas-microsoft-com:office:word" xmlns:w="http://schemas.openxmlformats.org/wordprocessingml/2006/main" xmlns:w14="http://schemas.microsoft.com/office/word/2010/wordml" xmlns:w15="http://schemas.microsoft.com/office/word/2012/wordml" xmlns:w16cex="http://schemas.microsoft.com/office/word/2018/wordml/cex" xmlns:w16cid="http://schemas.microsoft.com/office/word/2016/wordml/cid" xmlns:w16="http://schemas.microsoft.com/office/word/2018/wordml" xmlns:w16du="http://schemas.microsoft.com/office/word/2023/wordml/word16du" xmlns:w16sdtdh="http://schemas.microsoft.com/office/word/2020/wordml/sdtdatahash" xmlns:w16sdtfl="http://schemas.microsoft.com/office/word/2024/wordml/sdtformatlock" xmlns:w16se="http://schemas.microsoft.com/office/word/2015/wordml/symex" xmlns:wpg="http://schemas.microsoft.com/office/word/2010/wordprocessingGroup" xmlns:wpi="http://schemas.microsoft.com/office/word/2010/wordprocessingInk" xmlns:wne="http://schemas.microsoft.com/office/word/2006/wordml" xmlns:wps="http://schemas.microsoft.com/office/word/2010/wordprocessingShape" mc:Ignorable="w14 w15 w16se w16cid w16 w16cex w16sdtdh w16sdtfl w16du wp14">
   <w:endnote w:type="separator" w:id="-1">
     <w:p>
       <w:r>
@@ -19077,7 +20611,7 @@
 </file>
 
 <file path=word/footer1.xml><?xml version="1.0" encoding="utf-8"?>
-<w:ftr xmlns:wpc="http://schemas.microsoft.com/office/word/2010/wordprocessingCanvas" xmlns:cx="http://schemas.microsoft.com/office/drawing/2014/chartex" xmlns:cx1="http://schemas.microsoft.com/office/drawing/2015/9/8/chartex" xmlns:cx2="http://schemas.microsoft.com/office/drawing/2015/10/21/chartex" xmlns:cx3="http://schemas.microsoft.com/office/drawing/2016/5/9/chartex" xmlns:cx4="http://schemas.microsoft.com/office/drawing/2016/5/10/chartex" xmlns:cx5="http://schemas.microsoft.com/office/drawing/2016/5/11/chartex" xmlns:cx6="http://schemas.microsoft.com/office/drawing/2016/5/12/chartex" xmlns:cx7="http://schemas.microsoft.com/office/drawing/2016/5/13/chartex" xmlns:cx8="http://schemas.microsoft.com/office/drawing/2016/5/14/chartex" xmlns:mc="http://schemas.openxmlformats.org/markup-compatibility/2006" xmlns:aink="http://schemas.microsoft.com/office/drawing/2016/ink" xmlns:am3d="http://schemas.microsoft.com/office/drawing/2017/model3d" xmlns:o="urn:schemas-microsoft-com:office:office" xmlns:oel="http://schemas.microsoft.com/office/2019/extlst" xmlns:r="http://schemas.openxmlformats.org/officeDocument/2006/relationships" xmlns:m="http://schemas.openxmlformats.org/officeDocument/2006/math" xmlns:v="urn:schemas-microsoft-com:vml" xmlns:wp14="http://schemas.microsoft.com/office/word/2010/wordprocessingDrawing" xmlns:wp="http://schemas.openxmlformats.org/drawingml/2006/wordprocessingDrawing" xmlns:w10="urn:schemas-microsoft-com:office:word" xmlns:w="http://schemas.openxmlformats.org/wordprocessingml/2006/main" xmlns:w14="http://schemas.microsoft.com/office/word/2010/wordml" xmlns:w15="http://schemas.microsoft.com/office/word/2012/wordml" xmlns:w16cex="http://schemas.microsoft.com/office/word/2018/wordml/cex" xmlns:w16cid="http://schemas.microsoft.com/office/word/2016/wordml/cid" xmlns:w16="http://schemas.microsoft.com/office/word/2018/wordml" xmlns:w16du="http://schemas.microsoft.com/office/word/2023/wordml/word16du" xmlns:w16sdtdh="http://schemas.microsoft.com/office/word/2020/wordml/sdtdatahash" xmlns:w16se="http://schemas.microsoft.com/office/word/2015/wordml/symex" xmlns:wpg="http://schemas.microsoft.com/office/word/2010/wordprocessingGroup" xmlns:wpi="http://schemas.microsoft.com/office/word/2010/wordprocessingInk" xmlns:wne="http://schemas.microsoft.com/office/word/2006/wordml" xmlns:wps="http://schemas.microsoft.com/office/word/2010/wordprocessingShape" mc:Ignorable="w14 w15 w16se w16cid w16 w16cex w16sdtdh w16du wp14">
+<w:ftr xmlns:wpc="http://schemas.microsoft.com/office/word/2010/wordprocessingCanvas" xmlns:cx="http://schemas.microsoft.com/office/drawing/2014/chartex" xmlns:cx1="http://schemas.microsoft.com/office/drawing/2015/9/8/chartex" xmlns:cx2="http://schemas.microsoft.com/office/drawing/2015/10/21/chartex" xmlns:cx3="http://schemas.microsoft.com/office/drawing/2016/5/9/chartex" xmlns:cx4="http://schemas.microsoft.com/office/drawing/2016/5/10/chartex" xmlns:cx5="http://schemas.microsoft.com/office/drawing/2016/5/11/chartex" xmlns:cx6="http://schemas.microsoft.com/office/drawing/2016/5/12/chartex" xmlns:cx7="http://schemas.microsoft.com/office/drawing/2016/5/13/chartex" xmlns:cx8="http://schemas.microsoft.com/office/drawing/2016/5/14/chartex" xmlns:mc="http://schemas.openxmlformats.org/markup-compatibility/2006" xmlns:aink="http://schemas.microsoft.com/office/drawing/2016/ink" xmlns:am3d="http://schemas.microsoft.com/office/drawing/2017/model3d" xmlns:o="urn:schemas-microsoft-com:office:office" xmlns:oel="http://schemas.microsoft.com/office/2019/extlst" xmlns:r="http://schemas.openxmlformats.org/officeDocument/2006/relationships" xmlns:m="http://schemas.openxmlformats.org/officeDocument/2006/math" xmlns:v="urn:schemas-microsoft-com:vml" xmlns:wp14="http://schemas.microsoft.com/office/word/2010/wordprocessingDrawing" xmlns:wp="http://schemas.openxmlformats.org/drawingml/2006/wordprocessingDrawing" xmlns:w10="urn:schemas-microsoft-com:office:word" xmlns:w="http://schemas.openxmlformats.org/wordprocessingml/2006/main" xmlns:w14="http://schemas.microsoft.com/office/word/2010/wordml" xmlns:w15="http://schemas.microsoft.com/office/word/2012/wordml" xmlns:w16cex="http://schemas.microsoft.com/office/word/2018/wordml/cex" xmlns:w16cid="http://schemas.microsoft.com/office/word/2016/wordml/cid" xmlns:w16="http://schemas.microsoft.com/office/word/2018/wordml" xmlns:w16du="http://schemas.microsoft.com/office/word/2023/wordml/word16du" xmlns:w16sdtdh="http://schemas.microsoft.com/office/word/2020/wordml/sdtdatahash" xmlns:w16sdtfl="http://schemas.microsoft.com/office/word/2024/wordml/sdtformatlock" xmlns:w16se="http://schemas.microsoft.com/office/word/2015/wordml/symex" xmlns:wpg="http://schemas.microsoft.com/office/word/2010/wordprocessingGroup" xmlns:wpi="http://schemas.microsoft.com/office/word/2010/wordprocessingInk" xmlns:wne="http://schemas.microsoft.com/office/word/2006/wordml" xmlns:wps="http://schemas.microsoft.com/office/word/2010/wordprocessingShape" mc:Ignorable="w14 w15 w16se w16cid w16 w16cex w16sdtdh w16sdtfl w16du wp14">
   <w:p>
     <w:pPr>
       <w:pStyle w:val="Footer"/>
@@ -19478,7 +21012,7 @@
 </file>
 
 <file path=word/footer2.xml><?xml version="1.0" encoding="utf-8"?>
-<w:ftr xmlns:wpc="http://schemas.microsoft.com/office/word/2010/wordprocessingCanvas" xmlns:cx="http://schemas.microsoft.com/office/drawing/2014/chartex" xmlns:cx1="http://schemas.microsoft.com/office/drawing/2015/9/8/chartex" xmlns:cx2="http://schemas.microsoft.com/office/drawing/2015/10/21/chartex" xmlns:cx3="http://schemas.microsoft.com/office/drawing/2016/5/9/chartex" xmlns:cx4="http://schemas.microsoft.com/office/drawing/2016/5/10/chartex" xmlns:cx5="http://schemas.microsoft.com/office/drawing/2016/5/11/chartex" xmlns:cx6="http://schemas.microsoft.com/office/drawing/2016/5/12/chartex" xmlns:cx7="http://schemas.microsoft.com/office/drawing/2016/5/13/chartex" xmlns:cx8="http://schemas.microsoft.com/office/drawing/2016/5/14/chartex" xmlns:mc="http://schemas.openxmlformats.org/markup-compatibility/2006" xmlns:aink="http://schemas.microsoft.com/office/drawing/2016/ink" xmlns:am3d="http://schemas.microsoft.com/office/drawing/2017/model3d" xmlns:o="urn:schemas-microsoft-com:office:office" xmlns:oel="http://schemas.microsoft.com/office/2019/extlst" xmlns:r="http://schemas.openxmlformats.org/officeDocument/2006/relationships" xmlns:m="http://schemas.openxmlformats.org/officeDocument/2006/math" xmlns:v="urn:schemas-microsoft-com:vml" xmlns:wp14="http://schemas.microsoft.com/office/word/2010/wordprocessingDrawing" xmlns:wp="http://schemas.openxmlformats.org/drawingml/2006/wordprocessingDrawing" xmlns:w10="urn:schemas-microsoft-com:office:word" xmlns:w="http://schemas.openxmlformats.org/wordprocessingml/2006/main" xmlns:w14="http://schemas.microsoft.com/office/word/2010/wordml" xmlns:w15="http://schemas.microsoft.com/office/word/2012/wordml" xmlns:w16cex="http://schemas.microsoft.com/office/word/2018/wordml/cex" xmlns:w16cid="http://schemas.microsoft.com/office/word/2016/wordml/cid" xmlns:w16="http://schemas.microsoft.com/office/word/2018/wordml" xmlns:w16du="http://schemas.microsoft.com/office/word/2023/wordml/word16du" xmlns:w16sdtdh="http://schemas.microsoft.com/office/word/2020/wordml/sdtdatahash" xmlns:w16se="http://schemas.microsoft.com/office/word/2015/wordml/symex" xmlns:wpg="http://schemas.microsoft.com/office/word/2010/wordprocessingGroup" xmlns:wpi="http://schemas.microsoft.com/office/word/2010/wordprocessingInk" xmlns:wne="http://schemas.microsoft.com/office/word/2006/wordml" xmlns:wps="http://schemas.microsoft.com/office/word/2010/wordprocessingShape" mc:Ignorable="w14 w15 w16se w16cid w16 w16cex w16sdtdh w16du wp14">
+<w:ftr xmlns:wpc="http://schemas.microsoft.com/office/word/2010/wordprocessingCanvas" xmlns:cx="http://schemas.microsoft.com/office/drawing/2014/chartex" xmlns:cx1="http://schemas.microsoft.com/office/drawing/2015/9/8/chartex" xmlns:cx2="http://schemas.microsoft.com/office/drawing/2015/10/21/chartex" xmlns:cx3="http://schemas.microsoft.com/office/drawing/2016/5/9/chartex" xmlns:cx4="http://schemas.microsoft.com/office/drawing/2016/5/10/chartex" xmlns:cx5="http://schemas.microsoft.com/office/drawing/2016/5/11/chartex" xmlns:cx6="http://schemas.microsoft.com/office/drawing/2016/5/12/chartex" xmlns:cx7="http://schemas.microsoft.com/office/drawing/2016/5/13/chartex" xmlns:cx8="http://schemas.microsoft.com/office/drawing/2016/5/14/chartex" xmlns:mc="http://schemas.openxmlformats.org/markup-compatibility/2006" xmlns:aink="http://schemas.microsoft.com/office/drawing/2016/ink" xmlns:am3d="http://schemas.microsoft.com/office/drawing/2017/model3d" xmlns:o="urn:schemas-microsoft-com:office:office" xmlns:oel="http://schemas.microsoft.com/office/2019/extlst" xmlns:r="http://schemas.openxmlformats.org/officeDocument/2006/relationships" xmlns:m="http://schemas.openxmlformats.org/officeDocument/2006/math" xmlns:v="urn:schemas-microsoft-com:vml" xmlns:wp14="http://schemas.microsoft.com/office/word/2010/wordprocessingDrawing" xmlns:wp="http://schemas.openxmlformats.org/drawingml/2006/wordprocessingDrawing" xmlns:w10="urn:schemas-microsoft-com:office:word" xmlns:w="http://schemas.openxmlformats.org/wordprocessingml/2006/main" xmlns:w14="http://schemas.microsoft.com/office/word/2010/wordml" xmlns:w15="http://schemas.microsoft.com/office/word/2012/wordml" xmlns:w16cex="http://schemas.microsoft.com/office/word/2018/wordml/cex" xmlns:w16cid="http://schemas.microsoft.com/office/word/2016/wordml/cid" xmlns:w16="http://schemas.microsoft.com/office/word/2018/wordml" xmlns:w16du="http://schemas.microsoft.com/office/word/2023/wordml/word16du" xmlns:w16sdtdh="http://schemas.microsoft.com/office/word/2020/wordml/sdtdatahash" xmlns:w16sdtfl="http://schemas.microsoft.com/office/word/2024/wordml/sdtformatlock" xmlns:w16se="http://schemas.microsoft.com/office/word/2015/wordml/symex" xmlns:wpg="http://schemas.microsoft.com/office/word/2010/wordprocessingGroup" xmlns:wpi="http://schemas.microsoft.com/office/word/2010/wordprocessingInk" xmlns:wne="http://schemas.microsoft.com/office/word/2006/wordml" xmlns:wps="http://schemas.microsoft.com/office/word/2010/wordprocessingShape" mc:Ignorable="w14 w15 w16se w16cid w16 w16cex w16sdtdh w16sdtfl w16du wp14">
   <w:p>
     <w:pPr>
       <w:pStyle w:val="Footer"/>
@@ -19900,7 +21434,7 @@
 </file>
 
 <file path=word/footnotes.xml><?xml version="1.0" encoding="utf-8"?>
-<w:footnotes xmlns:wpc="http://schemas.microsoft.com/office/word/2010/wordprocessingCanvas" xmlns:cx="http://schemas.microsoft.com/office/drawing/2014/chartex" xmlns:cx1="http://schemas.microsoft.com/office/drawing/2015/9/8/chartex" xmlns:cx2="http://schemas.microsoft.com/office/drawing/2015/10/21/chartex" xmlns:cx3="http://schemas.microsoft.com/office/drawing/2016/5/9/chartex" xmlns:cx4="http://schemas.microsoft.com/office/drawing/2016/5/10/chartex" xmlns:cx5="http://schemas.microsoft.com/office/drawing/2016/5/11/chartex" xmlns:cx6="http://schemas.microsoft.com/office/drawing/2016/5/12/chartex" xmlns:cx7="http://schemas.microsoft.com/office/drawing/2016/5/13/chartex" xmlns:cx8="http://schemas.microsoft.com/office/drawing/2016/5/14/chartex" xmlns:mc="http://schemas.openxmlformats.org/markup-compatibility/2006" xmlns:aink="http://schemas.microsoft.com/office/drawing/2016/ink" xmlns:am3d="http://schemas.microsoft.com/office/drawing/2017/model3d" xmlns:o="urn:schemas-microsoft-com:office:office" xmlns:oel="http://schemas.microsoft.com/office/2019/extlst" xmlns:r="http://schemas.openxmlformats.org/officeDocument/2006/relationships" xmlns:m="http://schemas.openxmlformats.org/officeDocument/2006/math" xmlns:v="urn:schemas-microsoft-com:vml" xmlns:wp14="http://schemas.microsoft.com/office/word/2010/wordprocessingDrawing" xmlns:wp="http://schemas.openxmlformats.org/drawingml/2006/wordprocessingDrawing" xmlns:w10="urn:schemas-microsoft-com:office:word" xmlns:w="http://schemas.openxmlformats.org/wordprocessingml/2006/main" xmlns:w14="http://schemas.microsoft.com/office/word/2010/wordml" xmlns:w15="http://schemas.microsoft.com/office/word/2012/wordml" xmlns:w16cex="http://schemas.microsoft.com/office/word/2018/wordml/cex" xmlns:w16cid="http://schemas.microsoft.com/office/word/2016/wordml/cid" xmlns:w16="http://schemas.microsoft.com/office/word/2018/wordml" xmlns:w16du="http://schemas.microsoft.com/office/word/2023/wordml/word16du" xmlns:w16sdtdh="http://schemas.microsoft.com/office/word/2020/wordml/sdtdatahash" xmlns:w16se="http://schemas.microsoft.com/office/word/2015/wordml/symex" xmlns:wpg="http://schemas.microsoft.com/office/word/2010/wordprocessingGroup" xmlns:wpi="http://schemas.microsoft.com/office/word/2010/wordprocessingInk" xmlns:wne="http://schemas.microsoft.com/office/word/2006/wordml" xmlns:wps="http://schemas.microsoft.com/office/word/2010/wordprocessingShape" mc:Ignorable="w14 w15 w16se w16cid w16 w16cex w16sdtdh w16du wp14">
+<w:footnotes xmlns:wpc="http://schemas.microsoft.com/office/word/2010/wordprocessingCanvas" xmlns:cx="http://schemas.microsoft.com/office/drawing/2014/chartex" xmlns:cx1="http://schemas.microsoft.com/office/drawing/2015/9/8/chartex" xmlns:cx2="http://schemas.microsoft.com/office/drawing/2015/10/21/chartex" xmlns:cx3="http://schemas.microsoft.com/office/drawing/2016/5/9/chartex" xmlns:cx4="http://schemas.microsoft.com/office/drawing/2016/5/10/chartex" xmlns:cx5="http://schemas.microsoft.com/office/drawing/2016/5/11/chartex" xmlns:cx6="http://schemas.microsoft.com/office/drawing/2016/5/12/chartex" xmlns:cx7="http://schemas.microsoft.com/office/drawing/2016/5/13/chartex" xmlns:cx8="http://schemas.microsoft.com/office/drawing/2016/5/14/chartex" xmlns:mc="http://schemas.openxmlformats.org/markup-compatibility/2006" xmlns:aink="http://schemas.microsoft.com/office/drawing/2016/ink" xmlns:am3d="http://schemas.microsoft.com/office/drawing/2017/model3d" xmlns:o="urn:schemas-microsoft-com:office:office" xmlns:oel="http://schemas.microsoft.com/office/2019/extlst" xmlns:r="http://schemas.openxmlformats.org/officeDocument/2006/relationships" xmlns:m="http://schemas.openxmlformats.org/officeDocument/2006/math" xmlns:v="urn:schemas-microsoft-com:vml" xmlns:wp14="http://schemas.microsoft.com/office/word/2010/wordprocessingDrawing" xmlns:wp="http://schemas.openxmlformats.org/drawingml/2006/wordprocessingDrawing" xmlns:w10="urn:schemas-microsoft-com:office:word" xmlns:w="http://schemas.openxmlformats.org/wordprocessingml/2006/main" xmlns:w14="http://schemas.microsoft.com/office/word/2010/wordml" xmlns:w15="http://schemas.microsoft.com/office/word/2012/wordml" xmlns:w16cex="http://schemas.microsoft.com/office/word/2018/wordml/cex" xmlns:w16cid="http://schemas.microsoft.com/office/word/2016/wordml/cid" xmlns:w16="http://schemas.microsoft.com/office/word/2018/wordml" xmlns:w16du="http://schemas.microsoft.com/office/word/2023/wordml/word16du" xmlns:w16sdtdh="http://schemas.microsoft.com/office/word/2020/wordml/sdtdatahash" xmlns:w16sdtfl="http://schemas.microsoft.com/office/word/2024/wordml/sdtformatlock" xmlns:w16se="http://schemas.microsoft.com/office/word/2015/wordml/symex" xmlns:wpg="http://schemas.microsoft.com/office/word/2010/wordprocessingGroup" xmlns:wpi="http://schemas.microsoft.com/office/word/2010/wordprocessingInk" xmlns:wne="http://schemas.microsoft.com/office/word/2006/wordml" xmlns:wps="http://schemas.microsoft.com/office/word/2010/wordprocessingShape" mc:Ignorable="w14 w15 w16se w16cid w16 w16cex w16sdtdh w16sdtfl w16du wp14">
   <w:footnote w:type="separator" w:id="-1">
     <w:p>
       <w:pPr>
@@ -19932,7 +21466,7 @@
 </file>
 
 <file path=word/header1.xml><?xml version="1.0" encoding="utf-8"?>
-<w:hdr xmlns:wpc="http://schemas.microsoft.com/office/word/2010/wordprocessingCanvas" xmlns:cx="http://schemas.microsoft.com/office/drawing/2014/chartex" xmlns:cx1="http://schemas.microsoft.com/office/drawing/2015/9/8/chartex" xmlns:cx2="http://schemas.microsoft.com/office/drawing/2015/10/21/chartex" xmlns:cx3="http://schemas.microsoft.com/office/drawing/2016/5/9/chartex" xmlns:cx4="http://schemas.microsoft.com/office/drawing/2016/5/10/chartex" xmlns:cx5="http://schemas.microsoft.com/office/drawing/2016/5/11/chartex" xmlns:cx6="http://schemas.microsoft.com/office/drawing/2016/5/12/chartex" xmlns:cx7="http://schemas.microsoft.com/office/drawing/2016/5/13/chartex" xmlns:cx8="http://schemas.microsoft.com/office/drawing/2016/5/14/chartex" xmlns:mc="http://schemas.openxmlformats.org/markup-compatibility/2006" xmlns:aink="http://schemas.microsoft.com/office/drawing/2016/ink" xmlns:am3d="http://schemas.microsoft.com/office/drawing/2017/model3d" xmlns:o="urn:schemas-microsoft-com:office:office" xmlns:oel="http://schemas.microsoft.com/office/2019/extlst" xmlns:r="http://schemas.openxmlformats.org/officeDocument/2006/relationships" xmlns:m="http://schemas.openxmlformats.org/officeDocument/2006/math" xmlns:v="urn:schemas-microsoft-com:vml" xmlns:wp14="http://schemas.microsoft.com/office/word/2010/wordprocessingDrawing" xmlns:wp="http://schemas.openxmlformats.org/drawingml/2006/wordprocessingDrawing" xmlns:w10="urn:schemas-microsoft-com:office:word" xmlns:w="http://schemas.openxmlformats.org/wordprocessingml/2006/main" xmlns:w14="http://schemas.microsoft.com/office/word/2010/wordml" xmlns:w15="http://schemas.microsoft.com/office/word/2012/wordml" xmlns:w16cex="http://schemas.microsoft.com/office/word/2018/wordml/cex" xmlns:w16cid="http://schemas.microsoft.com/office/word/2016/wordml/cid" xmlns:w16="http://schemas.microsoft.com/office/word/2018/wordml" xmlns:w16du="http://schemas.microsoft.com/office/word/2023/wordml/word16du" xmlns:w16sdtdh="http://schemas.microsoft.com/office/word/2020/wordml/sdtdatahash" xmlns:w16se="http://schemas.microsoft.com/office/word/2015/wordml/symex" xmlns:wpg="http://schemas.microsoft.com/office/word/2010/wordprocessingGroup" xmlns:wpi="http://schemas.microsoft.com/office/word/2010/wordprocessingInk" xmlns:wne="http://schemas.microsoft.com/office/word/2006/wordml" xmlns:wps="http://schemas.microsoft.com/office/word/2010/wordprocessingShape" mc:Ignorable="w14 w15 w16se w16cid w16 w16cex w16sdtdh w16du wp14">
+<w:hdr xmlns:wpc="http://schemas.microsoft.com/office/word/2010/wordprocessingCanvas" xmlns:cx="http://schemas.microsoft.com/office/drawing/2014/chartex" xmlns:cx1="http://schemas.microsoft.com/office/drawing/2015/9/8/chartex" xmlns:cx2="http://schemas.microsoft.com/office/drawing/2015/10/21/chartex" xmlns:cx3="http://schemas.microsoft.com/office/drawing/2016/5/9/chartex" xmlns:cx4="http://schemas.microsoft.com/office/drawing/2016/5/10/chartex" xmlns:cx5="http://schemas.microsoft.com/office/drawing/2016/5/11/chartex" xmlns:cx6="http://schemas.microsoft.com/office/drawing/2016/5/12/chartex" xmlns:cx7="http://schemas.microsoft.com/office/drawing/2016/5/13/chartex" xmlns:cx8="http://schemas.microsoft.com/office/drawing/2016/5/14/chartex" xmlns:mc="http://schemas.openxmlformats.org/markup-compatibility/2006" xmlns:aink="http://schemas.microsoft.com/office/drawing/2016/ink" xmlns:am3d="http://schemas.microsoft.com/office/drawing/2017/model3d" xmlns:o="urn:schemas-microsoft-com:office:office" xmlns:oel="http://schemas.microsoft.com/office/2019/extlst" xmlns:r="http://schemas.openxmlformats.org/officeDocument/2006/relationships" xmlns:m="http://schemas.openxmlformats.org/officeDocument/2006/math" xmlns:v="urn:schemas-microsoft-com:vml" xmlns:wp14="http://schemas.microsoft.com/office/word/2010/wordprocessingDrawing" xmlns:wp="http://schemas.openxmlformats.org/drawingml/2006/wordprocessingDrawing" xmlns:w10="urn:schemas-microsoft-com:office:word" xmlns:w="http://schemas.openxmlformats.org/wordprocessingml/2006/main" xmlns:w14="http://schemas.microsoft.com/office/word/2010/wordml" xmlns:w15="http://schemas.microsoft.com/office/word/2012/wordml" xmlns:w16cex="http://schemas.microsoft.com/office/word/2018/wordml/cex" xmlns:w16cid="http://schemas.microsoft.com/office/word/2016/wordml/cid" xmlns:w16="http://schemas.microsoft.com/office/word/2018/wordml" xmlns:w16du="http://schemas.microsoft.com/office/word/2023/wordml/word16du" xmlns:w16sdtdh="http://schemas.microsoft.com/office/word/2020/wordml/sdtdatahash" xmlns:w16sdtfl="http://schemas.microsoft.com/office/word/2024/wordml/sdtformatlock" xmlns:w16se="http://schemas.microsoft.com/office/word/2015/wordml/symex" xmlns:wpg="http://schemas.microsoft.com/office/word/2010/wordprocessingGroup" xmlns:wpi="http://schemas.microsoft.com/office/word/2010/wordprocessingInk" xmlns:wne="http://schemas.microsoft.com/office/word/2006/wordml" xmlns:wps="http://schemas.microsoft.com/office/word/2010/wordprocessingShape" mc:Ignorable="w14 w15 w16se w16cid w16 w16cex w16sdtdh w16sdtfl w16du wp14">
   <w:p>
     <w:pPr>
       <w:pStyle w:val="Header"/>
@@ -19968,7 +21502,7 @@
               <wp:lineTo x="0" y="0"/>
             </wp:wrapPolygon>
           </wp:wrapTight>
-          <wp:docPr id="674408830" name="Picture 19" descr="Unimation Robotics | LinkedIn"/>
+          <wp:docPr id="128672734" name="Picture 19" descr="Unimation Robotics | LinkedIn"/>
           <wp:cNvGraphicFramePr>
             <a:graphicFrameLocks xmlns:a="http://schemas.openxmlformats.org/drawingml/2006/main" noChangeAspect="1"/>
           </wp:cNvGraphicFramePr>
@@ -20047,7 +21581,7 @@
               <wp:lineTo x="0" y="0"/>
             </wp:wrapPolygon>
           </wp:wrapTight>
-          <wp:docPr id="773514182" name="Picture 773514182" descr="A picture containing clipart&#10;&#10;Description automatically generated"/>
+          <wp:docPr id="1504141322" name="Picture 1504141322" descr="A picture containing clipart&#10;&#10;Description automatically generated"/>
           <wp:cNvGraphicFramePr>
             <a:graphicFrameLocks xmlns:a="http://schemas.openxmlformats.org/drawingml/2006/main" noChangeAspect="1"/>
           </wp:cNvGraphicFramePr>
@@ -20097,7 +21631,7 @@
 </file>
 
 <file path=word/header2.xml><?xml version="1.0" encoding="utf-8"?>
-<w:hdr xmlns:wpc="http://schemas.microsoft.com/office/word/2010/wordprocessingCanvas" xmlns:cx="http://schemas.microsoft.com/office/drawing/2014/chartex" xmlns:cx1="http://schemas.microsoft.com/office/drawing/2015/9/8/chartex" xmlns:cx2="http://schemas.microsoft.com/office/drawing/2015/10/21/chartex" xmlns:cx3="http://schemas.microsoft.com/office/drawing/2016/5/9/chartex" xmlns:cx4="http://schemas.microsoft.com/office/drawing/2016/5/10/chartex" xmlns:cx5="http://schemas.microsoft.com/office/drawing/2016/5/11/chartex" xmlns:cx6="http://schemas.microsoft.com/office/drawing/2016/5/12/chartex" xmlns:cx7="http://schemas.microsoft.com/office/drawing/2016/5/13/chartex" xmlns:cx8="http://schemas.microsoft.com/office/drawing/2016/5/14/chartex" xmlns:mc="http://schemas.openxmlformats.org/markup-compatibility/2006" xmlns:aink="http://schemas.microsoft.com/office/drawing/2016/ink" xmlns:am3d="http://schemas.microsoft.com/office/drawing/2017/model3d" xmlns:o="urn:schemas-microsoft-com:office:office" xmlns:oel="http://schemas.microsoft.com/office/2019/extlst" xmlns:r="http://schemas.openxmlformats.org/officeDocument/2006/relationships" xmlns:m="http://schemas.openxmlformats.org/officeDocument/2006/math" xmlns:v="urn:schemas-microsoft-com:vml" xmlns:wp14="http://schemas.microsoft.com/office/word/2010/wordprocessingDrawing" xmlns:wp="http://schemas.openxmlformats.org/drawingml/2006/wordprocessingDrawing" xmlns:w10="urn:schemas-microsoft-com:office:word" xmlns:w="http://schemas.openxmlformats.org/wordprocessingml/2006/main" xmlns:w14="http://schemas.microsoft.com/office/word/2010/wordml" xmlns:w15="http://schemas.microsoft.com/office/word/2012/wordml" xmlns:w16cex="http://schemas.microsoft.com/office/word/2018/wordml/cex" xmlns:w16cid="http://schemas.microsoft.com/office/word/2016/wordml/cid" xmlns:w16="http://schemas.microsoft.com/office/word/2018/wordml" xmlns:w16du="http://schemas.microsoft.com/office/word/2023/wordml/word16du" xmlns:w16sdtdh="http://schemas.microsoft.com/office/word/2020/wordml/sdtdatahash" xmlns:w16se="http://schemas.microsoft.com/office/word/2015/wordml/symex" xmlns:wpg="http://schemas.microsoft.com/office/word/2010/wordprocessingGroup" xmlns:wpi="http://schemas.microsoft.com/office/word/2010/wordprocessingInk" xmlns:wne="http://schemas.microsoft.com/office/word/2006/wordml" xmlns:wps="http://schemas.microsoft.com/office/word/2010/wordprocessingShape" mc:Ignorable="w14 w15 w16se w16cid w16 w16cex w16sdtdh w16du wp14">
+<w:hdr xmlns:wpc="http://schemas.microsoft.com/office/word/2010/wordprocessingCanvas" xmlns:cx="http://schemas.microsoft.com/office/drawing/2014/chartex" xmlns:cx1="http://schemas.microsoft.com/office/drawing/2015/9/8/chartex" xmlns:cx2="http://schemas.microsoft.com/office/drawing/2015/10/21/chartex" xmlns:cx3="http://schemas.microsoft.com/office/drawing/2016/5/9/chartex" xmlns:cx4="http://schemas.microsoft.com/office/drawing/2016/5/10/chartex" xmlns:cx5="http://schemas.microsoft.com/office/drawing/2016/5/11/chartex" xmlns:cx6="http://schemas.microsoft.com/office/drawing/2016/5/12/chartex" xmlns:cx7="http://schemas.microsoft.com/office/drawing/2016/5/13/chartex" xmlns:cx8="http://schemas.microsoft.com/office/drawing/2016/5/14/chartex" xmlns:mc="http://schemas.openxmlformats.org/markup-compatibility/2006" xmlns:aink="http://schemas.microsoft.com/office/drawing/2016/ink" xmlns:am3d="http://schemas.microsoft.com/office/drawing/2017/model3d" xmlns:o="urn:schemas-microsoft-com:office:office" xmlns:oel="http://schemas.microsoft.com/office/2019/extlst" xmlns:r="http://schemas.openxmlformats.org/officeDocument/2006/relationships" xmlns:m="http://schemas.openxmlformats.org/officeDocument/2006/math" xmlns:v="urn:schemas-microsoft-com:vml" xmlns:wp14="http://schemas.microsoft.com/office/word/2010/wordprocessingDrawing" xmlns:wp="http://schemas.openxmlformats.org/drawingml/2006/wordprocessingDrawing" xmlns:w10="urn:schemas-microsoft-com:office:word" xmlns:w="http://schemas.openxmlformats.org/wordprocessingml/2006/main" xmlns:w14="http://schemas.microsoft.com/office/word/2010/wordml" xmlns:w15="http://schemas.microsoft.com/office/word/2012/wordml" xmlns:w16cex="http://schemas.microsoft.com/office/word/2018/wordml/cex" xmlns:w16cid="http://schemas.microsoft.com/office/word/2016/wordml/cid" xmlns:w16="http://schemas.microsoft.com/office/word/2018/wordml" xmlns:w16du="http://schemas.microsoft.com/office/word/2023/wordml/word16du" xmlns:w16sdtdh="http://schemas.microsoft.com/office/word/2020/wordml/sdtdatahash" xmlns:w16sdtfl="http://schemas.microsoft.com/office/word/2024/wordml/sdtformatlock" xmlns:w16se="http://schemas.microsoft.com/office/word/2015/wordml/symex" xmlns:wpg="http://schemas.microsoft.com/office/word/2010/wordprocessingGroup" xmlns:wpi="http://schemas.microsoft.com/office/word/2010/wordprocessingInk" xmlns:wne="http://schemas.microsoft.com/office/word/2006/wordml" xmlns:wps="http://schemas.microsoft.com/office/word/2010/wordprocessingShape" mc:Ignorable="w14 w15 w16se w16cid w16 w16cex w16sdtdh w16sdtfl w16du wp14">
   <w:p>
     <w:pPr>
       <w:pStyle w:val="Header"/>
@@ -20131,7 +21665,7 @@
               <wp:lineTo x="0" y="0"/>
             </wp:wrapPolygon>
           </wp:wrapTight>
-          <wp:docPr id="1489043765" name="Picture 19" descr="Unimation Robotics | LinkedIn"/>
+          <wp:docPr id="935750416" name="Picture 19" descr="Unimation Robotics | LinkedIn"/>
           <wp:cNvGraphicFramePr>
             <a:graphicFrameLocks xmlns:a="http://schemas.openxmlformats.org/drawingml/2006/main" noChangeAspect="1"/>
           </wp:cNvGraphicFramePr>
@@ -20206,7 +21740,7 @@
               <wp:lineTo x="0" y="0"/>
             </wp:wrapPolygon>
           </wp:wrapTight>
-          <wp:docPr id="2144387995" name="Picture 2144387995"/>
+          <wp:docPr id="1109737545" name="Picture 1109737545"/>
           <wp:cNvGraphicFramePr>
             <a:graphicFrameLocks xmlns:a="http://schemas.openxmlformats.org/drawingml/2006/main" noChangeAspect="1"/>
           </wp:cNvGraphicFramePr>
@@ -20266,7 +21800,7 @@
 </file>
 
 <file path=word/numbering.xml><?xml version="1.0" encoding="utf-8"?>
-<w:numbering xmlns:wpc="http://schemas.microsoft.com/office/word/2010/wordprocessingCanvas" xmlns:cx="http://schemas.microsoft.com/office/drawing/2014/chartex" xmlns:cx1="http://schemas.microsoft.com/office/drawing/2015/9/8/chartex" xmlns:cx2="http://schemas.microsoft.com/office/drawing/2015/10/21/chartex" xmlns:cx3="http://schemas.microsoft.com/office/drawing/2016/5/9/chartex" xmlns:cx4="http://schemas.microsoft.com/office/drawing/2016/5/10/chartex" xmlns:cx5="http://schemas.microsoft.com/office/drawing/2016/5/11/chartex" xmlns:cx6="http://schemas.microsoft.com/office/drawing/2016/5/12/chartex" xmlns:cx7="http://schemas.microsoft.com/office/drawing/2016/5/13/chartex" xmlns:cx8="http://schemas.microsoft.com/office/drawing/2016/5/14/chartex" xmlns:mc="http://schemas.openxmlformats.org/markup-compatibility/2006" xmlns:aink="http://schemas.microsoft.com/office/drawing/2016/ink" xmlns:am3d="http://schemas.microsoft.com/office/drawing/2017/model3d" xmlns:o="urn:schemas-microsoft-com:office:office" xmlns:oel="http://schemas.microsoft.com/office/2019/extlst" xmlns:r="http://schemas.openxmlformats.org/officeDocument/2006/relationships" xmlns:m="http://schemas.openxmlformats.org/officeDocument/2006/math" xmlns:v="urn:schemas-microsoft-com:vml" xmlns:wp14="http://schemas.microsoft.com/office/word/2010/wordprocessingDrawing" xmlns:wp="http://schemas.openxmlformats.org/drawingml/2006/wordprocessingDrawing" xmlns:w10="urn:schemas-microsoft-com:office:word" xmlns:w="http://schemas.openxmlformats.org/wordprocessingml/2006/main" xmlns:w14="http://schemas.microsoft.com/office/word/2010/wordml" xmlns:w15="http://schemas.microsoft.com/office/word/2012/wordml" xmlns:w16cex="http://schemas.microsoft.com/office/word/2018/wordml/cex" xmlns:w16cid="http://schemas.microsoft.com/office/word/2016/wordml/cid" xmlns:w16="http://schemas.microsoft.com/office/word/2018/wordml" xmlns:w16du="http://schemas.microsoft.com/office/word/2023/wordml/word16du" xmlns:w16sdtdh="http://schemas.microsoft.com/office/word/2020/wordml/sdtdatahash" xmlns:w16se="http://schemas.microsoft.com/office/word/2015/wordml/symex" xmlns:wpg="http://schemas.microsoft.com/office/word/2010/wordprocessingGroup" xmlns:wpi="http://schemas.microsoft.com/office/word/2010/wordprocessingInk" xmlns:wne="http://schemas.microsoft.com/office/word/2006/wordml" xmlns:wps="http://schemas.microsoft.com/office/word/2010/wordprocessingShape" mc:Ignorable="w14 w15 w16se w16cid w16 w16cex w16sdtdh w16du wp14">
+<w:numbering xmlns:wpc="http://schemas.microsoft.com/office/word/2010/wordprocessingCanvas" xmlns:cx="http://schemas.microsoft.com/office/drawing/2014/chartex" xmlns:cx1="http://schemas.microsoft.com/office/drawing/2015/9/8/chartex" xmlns:cx2="http://schemas.microsoft.com/office/drawing/2015/10/21/chartex" xmlns:cx3="http://schemas.microsoft.com/office/drawing/2016/5/9/chartex" xmlns:cx4="http://schemas.microsoft.com/office/drawing/2016/5/10/chartex" xmlns:cx5="http://schemas.microsoft.com/office/drawing/2016/5/11/chartex" xmlns:cx6="http://schemas.microsoft.com/office/drawing/2016/5/12/chartex" xmlns:cx7="http://schemas.microsoft.com/office/drawing/2016/5/13/chartex" xmlns:cx8="http://schemas.microsoft.com/office/drawing/2016/5/14/chartex" xmlns:mc="http://schemas.openxmlformats.org/markup-compatibility/2006" xmlns:aink="http://schemas.microsoft.com/office/drawing/2016/ink" xmlns:am3d="http://schemas.microsoft.com/office/drawing/2017/model3d" xmlns:o="urn:schemas-microsoft-com:office:office" xmlns:oel="http://schemas.microsoft.com/office/2019/extlst" xmlns:r="http://schemas.openxmlformats.org/officeDocument/2006/relationships" xmlns:m="http://schemas.openxmlformats.org/officeDocument/2006/math" xmlns:v="urn:schemas-microsoft-com:vml" xmlns:wp14="http://schemas.microsoft.com/office/word/2010/wordprocessingDrawing" xmlns:wp="http://schemas.openxmlformats.org/drawingml/2006/wordprocessingDrawing" xmlns:w10="urn:schemas-microsoft-com:office:word" xmlns:w="http://schemas.openxmlformats.org/wordprocessingml/2006/main" xmlns:w14="http://schemas.microsoft.com/office/word/2010/wordml" xmlns:w15="http://schemas.microsoft.com/office/word/2012/wordml" xmlns:w16cex="http://schemas.microsoft.com/office/word/2018/wordml/cex" xmlns:w16cid="http://schemas.microsoft.com/office/word/2016/wordml/cid" xmlns:w16="http://schemas.microsoft.com/office/word/2018/wordml" xmlns:w16du="http://schemas.microsoft.com/office/word/2023/wordml/word16du" xmlns:w16sdtdh="http://schemas.microsoft.com/office/word/2020/wordml/sdtdatahash" xmlns:w16sdtfl="http://schemas.microsoft.com/office/word/2024/wordml/sdtformatlock" xmlns:w16se="http://schemas.microsoft.com/office/word/2015/wordml/symex" xmlns:wpg="http://schemas.microsoft.com/office/word/2010/wordprocessingGroup" xmlns:wpi="http://schemas.microsoft.com/office/word/2010/wordprocessingInk" xmlns:wne="http://schemas.microsoft.com/office/word/2006/wordml" xmlns:wps="http://schemas.microsoft.com/office/word/2010/wordprocessingShape" mc:Ignorable="w14 w15 w16se w16cid w16 w16cex w16sdtdh w16sdtfl w16du wp14">
   <w:abstractNum w:abstractNumId="0" w15:restartNumberingAfterBreak="0">
     <w:nsid w:val="FFFFFF81"/>
     <w:multiLevelType w:val="singleLevel"/>
@@ -26100,7 +27634,7 @@
 </file>
 
 <file path=word/styles.xml><?xml version="1.0" encoding="utf-8"?>
-<w:styles xmlns:mc="http://schemas.openxmlformats.org/markup-compatibility/2006" xmlns:r="http://schemas.openxmlformats.org/officeDocument/2006/relationships" xmlns:w="http://schemas.openxmlformats.org/wordprocessingml/2006/main" xmlns:w14="http://schemas.microsoft.com/office/word/2010/wordml" xmlns:w15="http://schemas.microsoft.com/office/word/2012/wordml" xmlns:w16cex="http://schemas.microsoft.com/office/word/2018/wordml/cex" xmlns:w16cid="http://schemas.microsoft.com/office/word/2016/wordml/cid" xmlns:w16="http://schemas.microsoft.com/office/word/2018/wordml" xmlns:w16du="http://schemas.microsoft.com/office/word/2023/wordml/word16du" xmlns:w16sdtdh="http://schemas.microsoft.com/office/word/2020/wordml/sdtdatahash" xmlns:w16se="http://schemas.microsoft.com/office/word/2015/wordml/symex" mc:Ignorable="w14 w15 w16se w16cid w16 w16cex w16sdtdh w16du">
+<w:styles xmlns:mc="http://schemas.openxmlformats.org/markup-compatibility/2006" xmlns:r="http://schemas.openxmlformats.org/officeDocument/2006/relationships" xmlns:w="http://schemas.openxmlformats.org/wordprocessingml/2006/main" xmlns:w14="http://schemas.microsoft.com/office/word/2010/wordml" xmlns:w15="http://schemas.microsoft.com/office/word/2012/wordml" xmlns:w16cex="http://schemas.microsoft.com/office/word/2018/wordml/cex" xmlns:w16cid="http://schemas.microsoft.com/office/word/2016/wordml/cid" xmlns:w16="http://schemas.microsoft.com/office/word/2018/wordml" xmlns:w16du="http://schemas.microsoft.com/office/word/2023/wordml/word16du" xmlns:w16sdtdh="http://schemas.microsoft.com/office/word/2020/wordml/sdtdatahash" xmlns:w16sdtfl="http://schemas.microsoft.com/office/word/2024/wordml/sdtformatlock" xmlns:w16se="http://schemas.microsoft.com/office/word/2015/wordml/symex" mc:Ignorable="w14 w15 w16se w16cid w16 w16cex w16sdtdh w16sdtfl w16du">
   <w:docDefaults>
     <w:rPrDefault>
       <w:rPr>
@@ -26700,6 +28234,7 @@
   <w:style w:type="character" w:default="1" w:styleId="DefaultParagraphFont">
     <w:name w:val="Default Paragraph Font"/>
     <w:uiPriority w:val="1"/>
+    <w:semiHidden/>
     <w:unhideWhenUsed/>
   </w:style>
   <w:style w:type="table" w:default="1" w:styleId="TableNormal">
@@ -31870,7 +33405,7 @@
 </file>
 
 <file path=word/glossary/document.xml><?xml version="1.0" encoding="utf-8"?>
-<w:glossaryDocument xmlns:wpc="http://schemas.microsoft.com/office/word/2010/wordprocessingCanvas" xmlns:cx="http://schemas.microsoft.com/office/drawing/2014/chartex" xmlns:cx1="http://schemas.microsoft.com/office/drawing/2015/9/8/chartex" xmlns:cx2="http://schemas.microsoft.com/office/drawing/2015/10/21/chartex" xmlns:cx3="http://schemas.microsoft.com/office/drawing/2016/5/9/chartex" xmlns:cx4="http://schemas.microsoft.com/office/drawing/2016/5/10/chartex" xmlns:cx5="http://schemas.microsoft.com/office/drawing/2016/5/11/chartex" xmlns:cx6="http://schemas.microsoft.com/office/drawing/2016/5/12/chartex" xmlns:cx7="http://schemas.microsoft.com/office/drawing/2016/5/13/chartex" xmlns:cx8="http://schemas.microsoft.com/office/drawing/2016/5/14/chartex" xmlns:mc="http://schemas.openxmlformats.org/markup-compatibility/2006" xmlns:aink="http://schemas.microsoft.com/office/drawing/2016/ink" xmlns:am3d="http://schemas.microsoft.com/office/drawing/2017/model3d" xmlns:o="urn:schemas-microsoft-com:office:office" xmlns:oel="http://schemas.microsoft.com/office/2019/extlst" xmlns:r="http://schemas.openxmlformats.org/officeDocument/2006/relationships" xmlns:m="http://schemas.openxmlformats.org/officeDocument/2006/math" xmlns:v="urn:schemas-microsoft-com:vml" xmlns:wp14="http://schemas.microsoft.com/office/word/2010/wordprocessingDrawing" xmlns:wp="http://schemas.openxmlformats.org/drawingml/2006/wordprocessingDrawing" xmlns:w10="urn:schemas-microsoft-com:office:word" xmlns:w="http://schemas.openxmlformats.org/wordprocessingml/2006/main" xmlns:w14="http://schemas.microsoft.com/office/word/2010/wordml" xmlns:w15="http://schemas.microsoft.com/office/word/2012/wordml" xmlns:w16cex="http://schemas.microsoft.com/office/word/2018/wordml/cex" xmlns:w16cid="http://schemas.microsoft.com/office/word/2016/wordml/cid" xmlns:w16="http://schemas.microsoft.com/office/word/2018/wordml" xmlns:w16du="http://schemas.microsoft.com/office/word/2023/wordml/word16du" xmlns:w16sdtdh="http://schemas.microsoft.com/office/word/2020/wordml/sdtdatahash" xmlns:w16se="http://schemas.microsoft.com/office/word/2015/wordml/symex" xmlns:wpg="http://schemas.microsoft.com/office/word/2010/wordprocessingGroup" xmlns:wpi="http://schemas.microsoft.com/office/word/2010/wordprocessingInk" xmlns:wne="http://schemas.microsoft.com/office/word/2006/wordml" xmlns:wps="http://schemas.microsoft.com/office/word/2010/wordprocessingShape" mc:Ignorable="w14 w15 w16se w16cid w16 w16cex w16sdtdh w16du wp14">
+<w:glossaryDocument xmlns:wpc="http://schemas.microsoft.com/office/word/2010/wordprocessingCanvas" xmlns:cx="http://schemas.microsoft.com/office/drawing/2014/chartex" xmlns:cx1="http://schemas.microsoft.com/office/drawing/2015/9/8/chartex" xmlns:cx2="http://schemas.microsoft.com/office/drawing/2015/10/21/chartex" xmlns:cx3="http://schemas.microsoft.com/office/drawing/2016/5/9/chartex" xmlns:cx4="http://schemas.microsoft.com/office/drawing/2016/5/10/chartex" xmlns:cx5="http://schemas.microsoft.com/office/drawing/2016/5/11/chartex" xmlns:cx6="http://schemas.microsoft.com/office/drawing/2016/5/12/chartex" xmlns:cx7="http://schemas.microsoft.com/office/drawing/2016/5/13/chartex" xmlns:cx8="http://schemas.microsoft.com/office/drawing/2016/5/14/chartex" xmlns:mc="http://schemas.openxmlformats.org/markup-compatibility/2006" xmlns:aink="http://schemas.microsoft.com/office/drawing/2016/ink" xmlns:am3d="http://schemas.microsoft.com/office/drawing/2017/model3d" xmlns:o="urn:schemas-microsoft-com:office:office" xmlns:oel="http://schemas.microsoft.com/office/2019/extlst" xmlns:r="http://schemas.openxmlformats.org/officeDocument/2006/relationships" xmlns:m="http://schemas.openxmlformats.org/officeDocument/2006/math" xmlns:v="urn:schemas-microsoft-com:vml" xmlns:wp14="http://schemas.microsoft.com/office/word/2010/wordprocessingDrawing" xmlns:wp="http://schemas.openxmlformats.org/drawingml/2006/wordprocessingDrawing" xmlns:w10="urn:schemas-microsoft-com:office:word" xmlns:w="http://schemas.openxmlformats.org/wordprocessingml/2006/main" xmlns:w14="http://schemas.microsoft.com/office/word/2010/wordml" xmlns:w15="http://schemas.microsoft.com/office/word/2012/wordml" xmlns:w16cex="http://schemas.microsoft.com/office/word/2018/wordml/cex" xmlns:w16cid="http://schemas.microsoft.com/office/word/2016/wordml/cid" xmlns:w16="http://schemas.microsoft.com/office/word/2018/wordml" xmlns:w16du="http://schemas.microsoft.com/office/word/2023/wordml/word16du" xmlns:w16sdtdh="http://schemas.microsoft.com/office/word/2020/wordml/sdtdatahash" xmlns:w16sdtfl="http://schemas.microsoft.com/office/word/2024/wordml/sdtformatlock" xmlns:w16se="http://schemas.microsoft.com/office/word/2015/wordml/symex" xmlns:wpg="http://schemas.microsoft.com/office/word/2010/wordprocessingGroup" xmlns:wpi="http://schemas.microsoft.com/office/word/2010/wordprocessingInk" xmlns:wne="http://schemas.microsoft.com/office/word/2006/wordml" xmlns:wps="http://schemas.microsoft.com/office/word/2010/wordprocessingShape" mc:Ignorable="w14 w15 w16se w16cid w16 w16cex w16sdtdh w16sdtfl w16du wp14">
   <w:docParts>
     <w:docPart>
       <w:docPartPr>
@@ -31896,7 +33431,7 @@
 </file>
 
 <file path=word/glossary/fontTable.xml><?xml version="1.0" encoding="utf-8"?>
-<w:fonts xmlns:mc="http://schemas.openxmlformats.org/markup-compatibility/2006" xmlns:r="http://schemas.openxmlformats.org/officeDocument/2006/relationships" xmlns:w="http://schemas.openxmlformats.org/wordprocessingml/2006/main" xmlns:w14="http://schemas.microsoft.com/office/word/2010/wordml" xmlns:w15="http://schemas.microsoft.com/office/word/2012/wordml" xmlns:w16cex="http://schemas.microsoft.com/office/word/2018/wordml/cex" xmlns:w16cid="http://schemas.microsoft.com/office/word/2016/wordml/cid" xmlns:w16="http://schemas.microsoft.com/office/word/2018/wordml" xmlns:w16du="http://schemas.microsoft.com/office/word/2023/wordml/word16du" xmlns:w16sdtdh="http://schemas.microsoft.com/office/word/2020/wordml/sdtdatahash" xmlns:w16se="http://schemas.microsoft.com/office/word/2015/wordml/symex" mc:Ignorable="w14 w15 w16se w16cid w16 w16cex w16sdtdh w16du">
+<w:fonts xmlns:mc="http://schemas.openxmlformats.org/markup-compatibility/2006" xmlns:r="http://schemas.openxmlformats.org/officeDocument/2006/relationships" xmlns:w="http://schemas.openxmlformats.org/wordprocessingml/2006/main" xmlns:w14="http://schemas.microsoft.com/office/word/2010/wordml" xmlns:w15="http://schemas.microsoft.com/office/word/2012/wordml" xmlns:w16cex="http://schemas.microsoft.com/office/word/2018/wordml/cex" xmlns:w16cid="http://schemas.microsoft.com/office/word/2016/wordml/cid" xmlns:w16="http://schemas.microsoft.com/office/word/2018/wordml" xmlns:w16du="http://schemas.microsoft.com/office/word/2023/wordml/word16du" xmlns:w16sdtdh="http://schemas.microsoft.com/office/word/2020/wordml/sdtdatahash" xmlns:w16sdtfl="http://schemas.microsoft.com/office/word/2024/wordml/sdtformatlock" xmlns:w16se="http://schemas.microsoft.com/office/word/2015/wordml/symex" mc:Ignorable="w14 w15 w16se w16cid w16 w16cex w16sdtdh w16sdtfl w16du">
   <w:font w:name="Symbol">
     <w:panose1 w:val="05050102010706020507"/>
     <w:charset w:val="02"/>
@@ -32118,7 +33653,7 @@
 </file>
 
 <file path=word/glossary/settings.xml><?xml version="1.0" encoding="utf-8"?>
-<w:settings xmlns:mc="http://schemas.openxmlformats.org/markup-compatibility/2006" xmlns:o="urn:schemas-microsoft-com:office:office" xmlns:r="http://schemas.openxmlformats.org/officeDocument/2006/relationships" xmlns:m="http://schemas.openxmlformats.org/officeDocument/2006/math" xmlns:v="urn:schemas-microsoft-com:vml" xmlns:w10="urn:schemas-microsoft-com:office:word" xmlns:w="http://schemas.openxmlformats.org/wordprocessingml/2006/main" xmlns:w14="http://schemas.microsoft.com/office/word/2010/wordml" xmlns:w15="http://schemas.microsoft.com/office/word/2012/wordml" xmlns:w16cex="http://schemas.microsoft.com/office/word/2018/wordml/cex" xmlns:w16cid="http://schemas.microsoft.com/office/word/2016/wordml/cid" xmlns:w16="http://schemas.microsoft.com/office/word/2018/wordml" xmlns:w16du="http://schemas.microsoft.com/office/word/2023/wordml/word16du" xmlns:w16sdtdh="http://schemas.microsoft.com/office/word/2020/wordml/sdtdatahash" xmlns:w16se="http://schemas.microsoft.com/office/word/2015/wordml/symex" xmlns:sl="http://schemas.openxmlformats.org/schemaLibrary/2006/main" mc:Ignorable="w14 w15 w16se w16cid w16 w16cex w16sdtdh w16du">
+<w:settings xmlns:mc="http://schemas.openxmlformats.org/markup-compatibility/2006" xmlns:o="urn:schemas-microsoft-com:office:office" xmlns:r="http://schemas.openxmlformats.org/officeDocument/2006/relationships" xmlns:m="http://schemas.openxmlformats.org/officeDocument/2006/math" xmlns:v="urn:schemas-microsoft-com:vml" xmlns:w10="urn:schemas-microsoft-com:office:word" xmlns:w="http://schemas.openxmlformats.org/wordprocessingml/2006/main" xmlns:w14="http://schemas.microsoft.com/office/word/2010/wordml" xmlns:w15="http://schemas.microsoft.com/office/word/2012/wordml" xmlns:w16cex="http://schemas.microsoft.com/office/word/2018/wordml/cex" xmlns:w16cid="http://schemas.microsoft.com/office/word/2016/wordml/cid" xmlns:w16="http://schemas.microsoft.com/office/word/2018/wordml" xmlns:w16du="http://schemas.microsoft.com/office/word/2023/wordml/word16du" xmlns:w16sdtdh="http://schemas.microsoft.com/office/word/2020/wordml/sdtdatahash" xmlns:w16sdtfl="http://schemas.microsoft.com/office/word/2024/wordml/sdtformatlock" xmlns:w16se="http://schemas.microsoft.com/office/word/2015/wordml/symex" xmlns:sl="http://schemas.openxmlformats.org/schemaLibrary/2006/main" mc:Ignorable="w14 w15 w16se w16cid w16 w16cex w16sdtdh w16sdtfl w16du">
   <w:defaultTabStop w:val="720"/>
   <w:characterSpacingControl w:val="doNotCompress"/>
   <w:compat>
@@ -32144,6 +33679,7 @@
     <w:rsid w:val="003D275C"/>
     <w:rsid w:val="003F75AA"/>
     <w:rsid w:val="004330AF"/>
+    <w:rsid w:val="00457DBD"/>
     <w:rsid w:val="00560417"/>
     <w:rsid w:val="005617E5"/>
     <w:rsid w:val="00567256"/>
@@ -32166,6 +33702,7 @@
     <w:rsid w:val="00A71DBA"/>
     <w:rsid w:val="00BF70A0"/>
     <w:rsid w:val="00C3009C"/>
+    <w:rsid w:val="00D0316D"/>
     <w:rsid w:val="00D130C0"/>
     <w:rsid w:val="00D36927"/>
     <w:rsid w:val="00D7701A"/>
@@ -32175,6 +33712,7 @@
     <w:rsid w:val="00EC4EE7"/>
     <w:rsid w:val="00EE1FBA"/>
     <w:rsid w:val="00F44155"/>
+    <w:rsid w:val="00F45523"/>
     <w:rsid w:val="00F877C4"/>
     <w:rsid w:val="00FC0085"/>
     <w:rsid w:val="00FC1B33"/>
@@ -32201,7 +33739,7 @@
 </file>
 
 <file path=word/glossary/styles.xml><?xml version="1.0" encoding="utf-8"?>
-<w:styles xmlns:mc="http://schemas.openxmlformats.org/markup-compatibility/2006" xmlns:r="http://schemas.openxmlformats.org/officeDocument/2006/relationships" xmlns:w="http://schemas.openxmlformats.org/wordprocessingml/2006/main" xmlns:w14="http://schemas.microsoft.com/office/word/2010/wordml" xmlns:w15="http://schemas.microsoft.com/office/word/2012/wordml" xmlns:w16cex="http://schemas.microsoft.com/office/word/2018/wordml/cex" xmlns:w16cid="http://schemas.microsoft.com/office/word/2016/wordml/cid" xmlns:w16="http://schemas.microsoft.com/office/word/2018/wordml" xmlns:w16du="http://schemas.microsoft.com/office/word/2023/wordml/word16du" xmlns:w16sdtdh="http://schemas.microsoft.com/office/word/2020/wordml/sdtdatahash" xmlns:w16se="http://schemas.microsoft.com/office/word/2015/wordml/symex" mc:Ignorable="w14 w15 w16se w16cid w16 w16cex w16sdtdh w16du">
+<w:styles xmlns:mc="http://schemas.openxmlformats.org/markup-compatibility/2006" xmlns:r="http://schemas.openxmlformats.org/officeDocument/2006/relationships" xmlns:w="http://schemas.openxmlformats.org/wordprocessingml/2006/main" xmlns:w14="http://schemas.microsoft.com/office/word/2010/wordml" xmlns:w15="http://schemas.microsoft.com/office/word/2012/wordml" xmlns:w16cex="http://schemas.microsoft.com/office/word/2018/wordml/cex" xmlns:w16cid="http://schemas.microsoft.com/office/word/2016/wordml/cid" xmlns:w16="http://schemas.microsoft.com/office/word/2018/wordml" xmlns:w16du="http://schemas.microsoft.com/office/word/2023/wordml/word16du" xmlns:w16sdtdh="http://schemas.microsoft.com/office/word/2020/wordml/sdtdatahash" xmlns:w16sdtfl="http://schemas.microsoft.com/office/word/2024/wordml/sdtformatlock" xmlns:w16se="http://schemas.microsoft.com/office/word/2015/wordml/symex" mc:Ignorable="w14 w15 w16se w16cid w16 w16cex w16sdtdh w16sdtfl w16du">
   <w:docDefaults>
     <w:rPrDefault>
       <w:rPr>
@@ -32632,7 +34170,7 @@
 </file>
 
 <file path=word/glossary/webSettings.xml><?xml version="1.0" encoding="utf-8"?>
-<w:webSettings xmlns:mc="http://schemas.openxmlformats.org/markup-compatibility/2006" xmlns:r="http://schemas.openxmlformats.org/officeDocument/2006/relationships" xmlns:w="http://schemas.openxmlformats.org/wordprocessingml/2006/main" xmlns:w14="http://schemas.microsoft.com/office/word/2010/wordml" xmlns:w15="http://schemas.microsoft.com/office/word/2012/wordml" xmlns:w16cex="http://schemas.microsoft.com/office/word/2018/wordml/cex" xmlns:w16cid="http://schemas.microsoft.com/office/word/2016/wordml/cid" xmlns:w16="http://schemas.microsoft.com/office/word/2018/wordml" xmlns:w16du="http://schemas.microsoft.com/office/word/2023/wordml/word16du" xmlns:w16sdtdh="http://schemas.microsoft.com/office/word/2020/wordml/sdtdatahash" xmlns:w16se="http://schemas.microsoft.com/office/word/2015/wordml/symex" mc:Ignorable="w14 w15 w16se w16cid w16 w16cex w16sdtdh w16du"/>
+<w:webSettings xmlns:mc="http://schemas.openxmlformats.org/markup-compatibility/2006" xmlns:r="http://schemas.openxmlformats.org/officeDocument/2006/relationships" xmlns:w="http://schemas.openxmlformats.org/wordprocessingml/2006/main" xmlns:w14="http://schemas.microsoft.com/office/word/2010/wordml" xmlns:w15="http://schemas.microsoft.com/office/word/2012/wordml" xmlns:w16cex="http://schemas.microsoft.com/office/word/2018/wordml/cex" xmlns:w16cid="http://schemas.microsoft.com/office/word/2016/wordml/cid" xmlns:w16="http://schemas.microsoft.com/office/word/2018/wordml" xmlns:w16du="http://schemas.microsoft.com/office/word/2023/wordml/word16du" xmlns:w16sdtdh="http://schemas.microsoft.com/office/word/2020/wordml/sdtdatahash" xmlns:w16sdtfl="http://schemas.microsoft.com/office/word/2024/wordml/sdtformatlock" xmlns:w16se="http://schemas.microsoft.com/office/word/2015/wordml/symex" mc:Ignorable="w14 w15 w16se w16cid w16 w16cex w16sdtdh w16sdtfl w16du"/>
 </file>
 
 <file path=word/theme/theme1.xml><?xml version="1.0" encoding="utf-8"?>
@@ -32919,10 +34457,6 @@
 </file>
 
 <file path=customXml/item1.xml><?xml version="1.0" encoding="utf-8"?>
-<b:Sources xmlns:b="http://schemas.openxmlformats.org/officeDocument/2006/bibliography" xmlns="http://schemas.openxmlformats.org/officeDocument/2006/bibliography" SelectedStyle="\APASixthEditionOfficeOnline.xsl" StyleName="APA" Version="6"/>
-</file>
-
-<file path=customXml/item2.xml><?xml version="1.0" encoding="utf-8"?>
 <s:customData xmlns="http://www.wps.cn/officeDocument/2013/wpsCustomData" xmlns:s="http://www.wps.cn/officeDocument/2013/wpsCustomData">
   <customSectProps>
     <customSectPr/>
@@ -32933,18 +34467,22 @@
 </s:customData>
 </file>
 
+<file path=customXml/item2.xml><?xml version="1.0" encoding="utf-8"?>
+<b:Sources xmlns:b="http://schemas.openxmlformats.org/officeDocument/2006/bibliography" xmlns="http://schemas.openxmlformats.org/officeDocument/2006/bibliography" SelectedStyle="\APASixthEditionOfficeOnline.xsl" StyleName="APA" Version="6"/>
+</file>
+
 <file path=customXml/itemProps1.xml><?xml version="1.0" encoding="utf-8"?>
+<ds:datastoreItem xmlns:ds="http://schemas.openxmlformats.org/officeDocument/2006/customXml" ds:itemID="{B1977F7D-205B-4081-913C-38D41E755F92}">
+  <ds:schemaRefs>
+    <ds:schemaRef ds:uri="http://www.wps.cn/officeDocument/2013/wpsCustomData"/>
+  </ds:schemaRefs>
+</ds:datastoreItem>
+</file>
+
+<file path=customXml/itemProps2.xml><?xml version="1.0" encoding="utf-8"?>
 <ds:datastoreItem xmlns:ds="http://schemas.openxmlformats.org/officeDocument/2006/customXml" ds:itemID="{14523D6D-8B41-440A-BA0F-34E9C8F63C79}">
   <ds:schemaRefs>
     <ds:schemaRef ds:uri="http://schemas.openxmlformats.org/officeDocument/2006/bibliography"/>
   </ds:schemaRefs>
 </ds:datastoreItem>
-</file>
-
-<file path=customXml/itemProps2.xml><?xml version="1.0" encoding="utf-8"?>
-<ds:datastoreItem xmlns:ds="http://schemas.openxmlformats.org/officeDocument/2006/customXml" ds:itemID="{B1977F7D-205B-4081-913C-38D41E755F92}">
-  <ds:schemaRefs>
-    <ds:schemaRef ds:uri="http://www.wps.cn/officeDocument/2013/wpsCustomData"/>
-  </ds:schemaRefs>
-</ds:datastoreItem>
 </file>
</xml_diff>